<commit_message>
feat: add video and fix presentation and specification
</commit_message>
<xml_diff>
--- a/2026_Б_ККП_ПЗПІ-23-1_Тітаренко_М_С.docx
+++ b/2026_Б_ККП_ПЗПІ-23-1_Тітаренко_М_С.docx
@@ -44,112 +44,77 @@
       <w:pPr>
         <w:pStyle w:val="a3"/>
         <w:spacing w:line="360" w:lineRule="auto"/>
-        <w:ind w:left="1" w:right="288" w:firstLine="707"/>
+        <w:ind w:firstLine="709"/>
         <w:jc w:val="both"/>
       </w:pPr>
       <w:r>
-        <w:t>Специфікац</w:t>
-      </w:r>
-      <w:r>
-        <w:t xml:space="preserve">ія </w:t>
-      </w:r>
-      <w:r>
+        <w:t xml:space="preserve">Специфікація API зроблена через </w:t>
+      </w:r>
+      <w:proofErr w:type="spellStart"/>
+      <w:r>
+        <w:t>Swagger</w:t>
+      </w:r>
+      <w:proofErr w:type="spellEnd"/>
+      <w:r>
+        <w:t xml:space="preserve"> на англійській мові так як це є галузевим стандартом для сучасної розробки програмного забезпечення. Вона створена для забезпечення безшовної та прозорої комунікації між сервером та будь-яким клієнтським застосунком (</w:t>
+      </w:r>
+      <w:proofErr w:type="spellStart"/>
+      <w:r>
+        <w:t>Web</w:t>
+      </w:r>
+      <w:proofErr w:type="spellEnd"/>
+      <w:r>
+        <w:t xml:space="preserve">, </w:t>
+      </w:r>
+      <w:proofErr w:type="spellStart"/>
+      <w:r>
+        <w:t>iOS</w:t>
+      </w:r>
+      <w:proofErr w:type="spellEnd"/>
+      <w:r>
+        <w:t xml:space="preserve">, </w:t>
+      </w:r>
+      <w:proofErr w:type="spellStart"/>
+      <w:r>
+        <w:t>Android</w:t>
+      </w:r>
+      <w:proofErr w:type="spellEnd"/>
+      <w:r>
+        <w:t xml:space="preserve">). Специфікація виглядає як інтерактивне </w:t>
+      </w:r>
+      <w:r>
+        <w:rPr>
+          <w:lang w:val="en-US"/>
+        </w:rPr>
         <w:t>API</w:t>
       </w:r>
       <w:r>
-        <w:t xml:space="preserve"> зроблена через </w:t>
-      </w:r>
-      <w:r>
-        <w:t>Swagger</w:t>
-      </w:r>
-      <w:r>
-        <w:t xml:space="preserve"> на англійській мові так як </w:t>
-      </w:r>
-      <w:r>
-        <w:t>це є галузевим стандартом для сучасної розробки програмного забезпечення.</w:t>
-      </w:r>
-      <w:r>
-        <w:t xml:space="preserve"> Вона</w:t>
-      </w:r>
-      <w:r>
-        <w:t xml:space="preserve"> створена для</w:t>
-      </w:r>
-      <w:r>
-        <w:t xml:space="preserve"> забезпечення безшовної та прозорої комунікації між сервером та будь-яким клієнтським застосунком (</w:t>
+        <w:t xml:space="preserve">, де можна викликати кожен </w:t>
       </w:r>
       <w:proofErr w:type="spellStart"/>
       <w:r>
-        <w:t>Web</w:t>
+        <w:t>ендпоінт</w:t>
       </w:r>
       <w:proofErr w:type="spellEnd"/>
       <w:r>
-        <w:t xml:space="preserve">, </w:t>
+        <w:t xml:space="preserve"> та побачити його відповідь. Також, є можливість додати </w:t>
       </w:r>
       <w:proofErr w:type="spellStart"/>
       <w:r>
-        <w:t>iOS</w:t>
+        <w:rPr>
+          <w:lang w:val="en-US"/>
+        </w:rPr>
+        <w:t>jwtToken</w:t>
       </w:r>
       <w:proofErr w:type="spellEnd"/>
       <w:r>
-        <w:t xml:space="preserve">, </w:t>
-      </w:r>
-      <w:proofErr w:type="spellStart"/>
-      <w:r>
-        <w:t>Android</w:t>
-      </w:r>
-      <w:proofErr w:type="spellEnd"/>
-      <w:r>
-        <w:t>)</w:t>
-      </w:r>
-      <w:r>
-        <w:t>.</w:t>
-      </w:r>
-      <w:r>
-        <w:t xml:space="preserve"> Специфікація виглядає як інтерактивне </w:t>
-      </w:r>
-      <w:r>
-        <w:rPr>
-          <w:lang w:val="en-US"/>
-        </w:rPr>
-        <w:t>API</w:t>
-      </w:r>
-      <w:r>
-        <w:t>,</w:t>
-      </w:r>
-      <w:r>
-        <w:t xml:space="preserve"> де можна викликати кожен </w:t>
-      </w:r>
-      <w:proofErr w:type="spellStart"/>
-      <w:r>
-        <w:t>ендпоінт</w:t>
-      </w:r>
-      <w:proofErr w:type="spellEnd"/>
-      <w:r>
-        <w:t xml:space="preserve"> та побачити його відповідь. </w:t>
-      </w:r>
-      <w:r>
-        <w:t xml:space="preserve">Також, є можливість додати </w:t>
-      </w:r>
-      <w:proofErr w:type="spellStart"/>
-      <w:r>
-        <w:rPr>
-          <w:lang w:val="en-US"/>
-        </w:rPr>
-        <w:t>jwtToken</w:t>
-      </w:r>
-      <w:proofErr w:type="spellEnd"/>
-      <w:r>
-        <w:t xml:space="preserve"> для авторизації.</w:t>
-      </w:r>
-      <w:r>
-        <w:t xml:space="preserve"> </w:t>
-      </w:r>
-    </w:p>
-    <w:p>
-      <w:pPr>
-        <w:pStyle w:val="a3"/>
-        <w:spacing w:line="360" w:lineRule="auto"/>
-        <w:ind w:right="288"/>
+        <w:t xml:space="preserve"> для авторизації. </w:t>
+      </w:r>
+    </w:p>
+    <w:p>
+      <w:pPr>
+        <w:pStyle w:val="a3"/>
+        <w:spacing w:line="360" w:lineRule="auto"/>
         <w:jc w:val="center"/>
       </w:pPr>
       <w:r>
@@ -157,10 +122,10 @@
           <w:noProof/>
         </w:rPr>
         <w:drawing>
-          <wp:inline distT="0" distB="0" distL="0" distR="0" wp14:anchorId="1B61D868" wp14:editId="13B7CB9A">
-            <wp:extent cx="6085205" cy="1029300"/>
-            <wp:effectExtent l="0" t="0" r="0" b="0"/>
-            <wp:docPr id="80" name="Рисунок 80"/>
+          <wp:inline distT="0" distB="0" distL="0" distR="0">
+            <wp:extent cx="6088380" cy="1028700"/>
+            <wp:effectExtent l="0" t="0" r="7620" b="0"/>
+            <wp:docPr id="174" name="Рисунок 174"/>
             <wp:cNvGraphicFramePr>
               <a:graphicFrameLocks xmlns:a="http://schemas.openxmlformats.org/drawingml/2006/main" noChangeAspect="1"/>
             </wp:cNvGraphicFramePr>
@@ -168,23 +133,36 @@
               <a:graphicData uri="http://schemas.openxmlformats.org/drawingml/2006/picture">
                 <pic:pic xmlns:pic="http://schemas.openxmlformats.org/drawingml/2006/picture">
                   <pic:nvPicPr>
-                    <pic:cNvPr id="1" name=""/>
-                    <pic:cNvPicPr/>
+                    <pic:cNvPr id="0" name="Рисунок 80"/>
+                    <pic:cNvPicPr>
+                      <a:picLocks noChangeAspect="1" noChangeArrowheads="1"/>
+                    </pic:cNvPicPr>
                   </pic:nvPicPr>
                   <pic:blipFill>
-                    <a:blip r:embed="rId7"/>
+                    <a:blip r:embed="rId7" cstate="print">
+                      <a:extLst>
+                        <a:ext uri="{28A0092B-C50C-407E-A947-70E740481C1C}">
+                          <a14:useLocalDpi xmlns:a14="http://schemas.microsoft.com/office/drawing/2010/main" val="0"/>
+                        </a:ext>
+                      </a:extLst>
+                    </a:blip>
+                    <a:srcRect/>
                     <a:stretch>
                       <a:fillRect/>
                     </a:stretch>
                   </pic:blipFill>
-                  <pic:spPr>
+                  <pic:spPr bwMode="auto">
                     <a:xfrm>
                       <a:off x="0" y="0"/>
-                      <a:ext cx="6210967" cy="1050572"/>
+                      <a:ext cx="6088380" cy="1028700"/>
                     </a:xfrm>
                     <a:prstGeom prst="rect">
                       <a:avLst/>
                     </a:prstGeom>
+                    <a:noFill/>
+                    <a:ln>
+                      <a:noFill/>
+                    </a:ln>
                   </pic:spPr>
                 </pic:pic>
               </a:graphicData>
@@ -197,26 +175,23 @@
       <w:pPr>
         <w:pStyle w:val="a3"/>
         <w:spacing w:line="360" w:lineRule="auto"/>
-        <w:ind w:right="288"/>
-        <w:jc w:val="center"/>
-      </w:pPr>
-      <w:r>
-        <w:t>Рисунок В.1 – Загальний опис</w:t>
-      </w:r>
-    </w:p>
-    <w:p>
-      <w:pPr>
-        <w:pStyle w:val="a3"/>
-        <w:spacing w:line="360" w:lineRule="auto"/>
-        <w:ind w:right="288"/>
-        <w:jc w:val="center"/>
-      </w:pPr>
-    </w:p>
-    <w:p>
-      <w:pPr>
-        <w:pStyle w:val="a3"/>
-        <w:spacing w:line="360" w:lineRule="auto"/>
-        <w:ind w:right="288"/>
+        <w:jc w:val="center"/>
+      </w:pPr>
+      <w:r>
+        <w:t>Рисунок 1 – Загальний опис</w:t>
+      </w:r>
+    </w:p>
+    <w:p>
+      <w:pPr>
+        <w:pStyle w:val="a3"/>
+        <w:spacing w:line="360" w:lineRule="auto"/>
+        <w:jc w:val="center"/>
+      </w:pPr>
+    </w:p>
+    <w:p>
+      <w:pPr>
+        <w:pStyle w:val="a3"/>
+        <w:spacing w:line="360" w:lineRule="auto"/>
         <w:jc w:val="center"/>
       </w:pPr>
       <w:r>
@@ -224,10 +199,10 @@
           <w:noProof/>
         </w:rPr>
         <w:drawing>
-          <wp:inline distT="0" distB="0" distL="0" distR="0" wp14:anchorId="2120A89D" wp14:editId="56595931">
-            <wp:extent cx="6483350" cy="1520190"/>
-            <wp:effectExtent l="0" t="0" r="0" b="3810"/>
-            <wp:docPr id="84" name="Рисунок 84"/>
+          <wp:inline distT="0" distB="0" distL="0" distR="0">
+            <wp:extent cx="6483350" cy="1516380"/>
+            <wp:effectExtent l="0" t="0" r="0" b="7620"/>
+            <wp:docPr id="173" name="Рисунок 173"/>
             <wp:cNvGraphicFramePr>
               <a:graphicFrameLocks xmlns:a="http://schemas.openxmlformats.org/drawingml/2006/main" noChangeAspect="1"/>
             </wp:cNvGraphicFramePr>
@@ -235,23 +210,36 @@
               <a:graphicData uri="http://schemas.openxmlformats.org/drawingml/2006/picture">
                 <pic:pic xmlns:pic="http://schemas.openxmlformats.org/drawingml/2006/picture">
                   <pic:nvPicPr>
-                    <pic:cNvPr id="1" name=""/>
-                    <pic:cNvPicPr/>
+                    <pic:cNvPr id="0" name="Рисунок 84"/>
+                    <pic:cNvPicPr>
+                      <a:picLocks noChangeAspect="1" noChangeArrowheads="1"/>
+                    </pic:cNvPicPr>
                   </pic:nvPicPr>
                   <pic:blipFill>
-                    <a:blip r:embed="rId8"/>
+                    <a:blip r:embed="rId8">
+                      <a:extLst>
+                        <a:ext uri="{28A0092B-C50C-407E-A947-70E740481C1C}">
+                          <a14:useLocalDpi xmlns:a14="http://schemas.microsoft.com/office/drawing/2010/main" val="0"/>
+                        </a:ext>
+                      </a:extLst>
+                    </a:blip>
+                    <a:srcRect/>
                     <a:stretch>
                       <a:fillRect/>
                     </a:stretch>
                   </pic:blipFill>
-                  <pic:spPr>
+                  <pic:spPr bwMode="auto">
                     <a:xfrm>
                       <a:off x="0" y="0"/>
-                      <a:ext cx="6483350" cy="1520190"/>
+                      <a:ext cx="6483350" cy="1516380"/>
                     </a:xfrm>
                     <a:prstGeom prst="rect">
                       <a:avLst/>
                     </a:prstGeom>
+                    <a:noFill/>
+                    <a:ln>
+                      <a:noFill/>
+                    </a:ln>
                   </pic:spPr>
                 </pic:pic>
               </a:graphicData>
@@ -264,20 +252,10 @@
       <w:pPr>
         <w:pStyle w:val="a3"/>
         <w:spacing w:line="360" w:lineRule="auto"/>
-        <w:ind w:right="288"/>
-        <w:jc w:val="center"/>
-      </w:pPr>
-      <w:r>
-        <w:t>Рисунок В.</w:t>
-      </w:r>
-      <w:r>
-        <w:t>2</w:t>
-      </w:r>
-      <w:r>
-        <w:t xml:space="preserve"> – </w:t>
-      </w:r>
-      <w:r>
-        <w:t>Методи для додавання до групи (</w:t>
+        <w:jc w:val="center"/>
+      </w:pPr>
+      <w:r>
+        <w:t>Рисунок 2 – Методи для додавання до групи (</w:t>
       </w:r>
       <w:proofErr w:type="spellStart"/>
       <w:r>
@@ -295,15 +273,13 @@
       <w:pPr>
         <w:pStyle w:val="a3"/>
         <w:spacing w:line="360" w:lineRule="auto"/>
-        <w:ind w:right="288"/>
-        <w:jc w:val="center"/>
-      </w:pPr>
-    </w:p>
-    <w:p>
-      <w:pPr>
-        <w:pStyle w:val="a3"/>
-        <w:spacing w:line="360" w:lineRule="auto"/>
-        <w:ind w:right="288"/>
+        <w:jc w:val="center"/>
+      </w:pPr>
+    </w:p>
+    <w:p>
+      <w:pPr>
+        <w:pStyle w:val="a3"/>
+        <w:spacing w:line="360" w:lineRule="auto"/>
         <w:jc w:val="center"/>
       </w:pPr>
       <w:r>
@@ -312,10 +288,10 @@
         </w:rPr>
         <w:lastRenderedPageBreak/>
         <w:drawing>
-          <wp:inline distT="0" distB="0" distL="0" distR="0" wp14:anchorId="17957173" wp14:editId="6E96659C">
-            <wp:extent cx="5761357" cy="4013200"/>
-            <wp:effectExtent l="0" t="0" r="0" b="6350"/>
-            <wp:docPr id="85" name="Рисунок 85"/>
+          <wp:inline distT="0" distB="0" distL="0" distR="0">
+            <wp:extent cx="5212080" cy="3627120"/>
+            <wp:effectExtent l="0" t="0" r="7620" b="0"/>
+            <wp:docPr id="172" name="Рисунок 172"/>
             <wp:cNvGraphicFramePr>
               <a:graphicFrameLocks xmlns:a="http://schemas.openxmlformats.org/drawingml/2006/main" noChangeAspect="1"/>
             </wp:cNvGraphicFramePr>
@@ -323,23 +299,36 @@
               <a:graphicData uri="http://schemas.openxmlformats.org/drawingml/2006/picture">
                 <pic:pic xmlns:pic="http://schemas.openxmlformats.org/drawingml/2006/picture">
                   <pic:nvPicPr>
-                    <pic:cNvPr id="1" name=""/>
-                    <pic:cNvPicPr/>
+                    <pic:cNvPr id="0" name="Рисунок 85"/>
+                    <pic:cNvPicPr>
+                      <a:picLocks noChangeAspect="1" noChangeArrowheads="1"/>
+                    </pic:cNvPicPr>
                   </pic:nvPicPr>
                   <pic:blipFill>
-                    <a:blip r:embed="rId9"/>
+                    <a:blip r:embed="rId9">
+                      <a:extLst>
+                        <a:ext uri="{28A0092B-C50C-407E-A947-70E740481C1C}">
+                          <a14:useLocalDpi xmlns:a14="http://schemas.microsoft.com/office/drawing/2010/main" val="0"/>
+                        </a:ext>
+                      </a:extLst>
+                    </a:blip>
+                    <a:srcRect/>
                     <a:stretch>
                       <a:fillRect/>
                     </a:stretch>
                   </pic:blipFill>
-                  <pic:spPr>
+                  <pic:spPr bwMode="auto">
                     <a:xfrm>
                       <a:off x="0" y="0"/>
-                      <a:ext cx="5771006" cy="4019921"/>
+                      <a:ext cx="5212080" cy="3627120"/>
                     </a:xfrm>
                     <a:prstGeom prst="rect">
                       <a:avLst/>
                     </a:prstGeom>
+                    <a:noFill/>
+                    <a:ln>
+                      <a:noFill/>
+                    </a:ln>
                   </pic:spPr>
                 </pic:pic>
               </a:graphicData>
@@ -352,20 +341,10 @@
       <w:pPr>
         <w:pStyle w:val="a3"/>
         <w:spacing w:line="360" w:lineRule="auto"/>
-        <w:ind w:right="288"/>
-        <w:jc w:val="center"/>
-      </w:pPr>
-      <w:r>
-        <w:t>Рисунок В.</w:t>
-      </w:r>
-      <w:r>
-        <w:t>3</w:t>
-      </w:r>
-      <w:r>
-        <w:t xml:space="preserve"> – </w:t>
-      </w:r>
-      <w:r>
-        <w:t>Події та їх схеми (</w:t>
+        <w:jc w:val="center"/>
+      </w:pPr>
+      <w:r>
+        <w:t>Рисунок 3 – Події та їх схеми (</w:t>
       </w:r>
       <w:proofErr w:type="spellStart"/>
       <w:r>
@@ -382,8 +361,7 @@
     <w:p>
       <w:pPr>
         <w:pStyle w:val="a3"/>
-        <w:spacing w:before="1" w:line="360" w:lineRule="auto"/>
-        <w:ind w:left="1" w:right="285"/>
+        <w:spacing w:line="360" w:lineRule="auto"/>
         <w:jc w:val="both"/>
       </w:pPr>
       <w:bookmarkStart w:id="0" w:name="_TOC_250019"/>
@@ -403,10 +381,10 @@
           <w:noProof/>
         </w:rPr>
         <w:drawing>
-          <wp:inline distT="0" distB="0" distL="0" distR="0" wp14:anchorId="7900095A" wp14:editId="2D341059">
-            <wp:extent cx="4617720" cy="4270825"/>
+          <wp:inline distT="0" distB="0" distL="0" distR="0">
+            <wp:extent cx="4617720" cy="4274820"/>
             <wp:effectExtent l="0" t="0" r="0" b="0"/>
-            <wp:docPr id="86" name="Рисунок 86"/>
+            <wp:docPr id="171" name="Рисунок 171"/>
             <wp:cNvGraphicFramePr>
               <a:graphicFrameLocks xmlns:a="http://schemas.openxmlformats.org/drawingml/2006/main" noChangeAspect="1"/>
             </wp:cNvGraphicFramePr>
@@ -414,23 +392,36 @@
               <a:graphicData uri="http://schemas.openxmlformats.org/drawingml/2006/picture">
                 <pic:pic xmlns:pic="http://schemas.openxmlformats.org/drawingml/2006/picture">
                   <pic:nvPicPr>
-                    <pic:cNvPr id="1" name=""/>
-                    <pic:cNvPicPr/>
+                    <pic:cNvPr id="0" name="Рисунок 86"/>
+                    <pic:cNvPicPr>
+                      <a:picLocks noChangeAspect="1" noChangeArrowheads="1"/>
+                    </pic:cNvPicPr>
                   </pic:nvPicPr>
                   <pic:blipFill>
-                    <a:blip r:embed="rId10"/>
+                    <a:blip r:embed="rId10">
+                      <a:extLst>
+                        <a:ext uri="{28A0092B-C50C-407E-A947-70E740481C1C}">
+                          <a14:useLocalDpi xmlns:a14="http://schemas.microsoft.com/office/drawing/2010/main" val="0"/>
+                        </a:ext>
+                      </a:extLst>
+                    </a:blip>
+                    <a:srcRect/>
                     <a:stretch>
                       <a:fillRect/>
                     </a:stretch>
                   </pic:blipFill>
-                  <pic:spPr>
+                  <pic:spPr bwMode="auto">
                     <a:xfrm>
                       <a:off x="0" y="0"/>
-                      <a:ext cx="4634631" cy="4286466"/>
+                      <a:ext cx="4617720" cy="4274820"/>
                     </a:xfrm>
                     <a:prstGeom prst="rect">
                       <a:avLst/>
                     </a:prstGeom>
+                    <a:noFill/>
+                    <a:ln>
+                      <a:noFill/>
+                    </a:ln>
                   </pic:spPr>
                 </pic:pic>
               </a:graphicData>
@@ -443,20 +434,10 @@
       <w:pPr>
         <w:pStyle w:val="a3"/>
         <w:spacing w:line="360" w:lineRule="auto"/>
-        <w:ind w:right="288"/>
-        <w:jc w:val="center"/>
-      </w:pPr>
-      <w:r>
-        <w:t>Рисунок В.</w:t>
-      </w:r>
-      <w:r>
-        <w:t>4</w:t>
-      </w:r>
-      <w:r>
-        <w:t xml:space="preserve"> – </w:t>
-      </w:r>
-      <w:r>
-        <w:t>Події та їх схеми (продовження) (</w:t>
+        <w:jc w:val="center"/>
+      </w:pPr>
+      <w:r>
+        <w:t>Рисунок 4 – Події та їх схеми (продовження) (</w:t>
       </w:r>
       <w:proofErr w:type="spellStart"/>
       <w:r>
@@ -474,15 +455,13 @@
       <w:pPr>
         <w:pStyle w:val="a3"/>
         <w:spacing w:line="360" w:lineRule="auto"/>
-        <w:ind w:right="288"/>
-        <w:jc w:val="center"/>
-      </w:pPr>
-    </w:p>
-    <w:p>
-      <w:pPr>
-        <w:pStyle w:val="a3"/>
-        <w:spacing w:line="360" w:lineRule="auto"/>
-        <w:ind w:right="288"/>
+        <w:jc w:val="center"/>
+      </w:pPr>
+    </w:p>
+    <w:p>
+      <w:pPr>
+        <w:pStyle w:val="a3"/>
+        <w:spacing w:line="360" w:lineRule="auto"/>
         <w:jc w:val="center"/>
       </w:pPr>
       <w:r>
@@ -491,10 +470,10 @@
         </w:rPr>
         <w:lastRenderedPageBreak/>
         <w:drawing>
-          <wp:inline distT="0" distB="0" distL="0" distR="0" wp14:anchorId="5C5316AF" wp14:editId="0D38BBDB">
-            <wp:extent cx="5852160" cy="2439451"/>
+          <wp:inline distT="0" distB="0" distL="0" distR="0">
+            <wp:extent cx="5852160" cy="2438400"/>
             <wp:effectExtent l="0" t="0" r="0" b="0"/>
-            <wp:docPr id="87" name="Рисунок 87"/>
+            <wp:docPr id="170" name="Рисунок 170"/>
             <wp:cNvGraphicFramePr>
               <a:graphicFrameLocks xmlns:a="http://schemas.openxmlformats.org/drawingml/2006/main" noChangeAspect="1"/>
             </wp:cNvGraphicFramePr>
@@ -502,23 +481,36 @@
               <a:graphicData uri="http://schemas.openxmlformats.org/drawingml/2006/picture">
                 <pic:pic xmlns:pic="http://schemas.openxmlformats.org/drawingml/2006/picture">
                   <pic:nvPicPr>
-                    <pic:cNvPr id="1" name=""/>
-                    <pic:cNvPicPr/>
+                    <pic:cNvPr id="0" name="Рисунок 87"/>
+                    <pic:cNvPicPr>
+                      <a:picLocks noChangeAspect="1" noChangeArrowheads="1"/>
+                    </pic:cNvPicPr>
                   </pic:nvPicPr>
                   <pic:blipFill>
-                    <a:blip r:embed="rId11"/>
+                    <a:blip r:embed="rId11">
+                      <a:extLst>
+                        <a:ext uri="{28A0092B-C50C-407E-A947-70E740481C1C}">
+                          <a14:useLocalDpi xmlns:a14="http://schemas.microsoft.com/office/drawing/2010/main" val="0"/>
+                        </a:ext>
+                      </a:extLst>
+                    </a:blip>
+                    <a:srcRect/>
                     <a:stretch>
                       <a:fillRect/>
                     </a:stretch>
                   </pic:blipFill>
-                  <pic:spPr>
+                  <pic:spPr bwMode="auto">
                     <a:xfrm>
                       <a:off x="0" y="0"/>
-                      <a:ext cx="5886464" cy="2453750"/>
+                      <a:ext cx="5852160" cy="2438400"/>
                     </a:xfrm>
                     <a:prstGeom prst="rect">
                       <a:avLst/>
                     </a:prstGeom>
+                    <a:noFill/>
+                    <a:ln>
+                      <a:noFill/>
+                    </a:ln>
                   </pic:spPr>
                 </pic:pic>
               </a:graphicData>
@@ -534,16 +526,7 @@
         <w:jc w:val="center"/>
       </w:pPr>
       <w:r>
-        <w:t>Рисунок В.</w:t>
-      </w:r>
-      <w:r>
-        <w:t>5</w:t>
-      </w:r>
-      <w:r>
-        <w:t xml:space="preserve"> – </w:t>
-      </w:r>
-      <w:r>
-        <w:t>Схема помилки</w:t>
+        <w:t>Рисунок 5 – Схема помилки</w:t>
       </w:r>
     </w:p>
     <w:p>
@@ -563,10 +546,10 @@
           <w:noProof/>
         </w:rPr>
         <w:drawing>
-          <wp:inline distT="0" distB="0" distL="0" distR="0" wp14:anchorId="062B3ACF" wp14:editId="7840976F">
-            <wp:extent cx="6483350" cy="501650"/>
+          <wp:inline distT="0" distB="0" distL="0" distR="0">
+            <wp:extent cx="6483350" cy="502920"/>
             <wp:effectExtent l="0" t="0" r="0" b="0"/>
-            <wp:docPr id="88" name="Рисунок 88"/>
+            <wp:docPr id="169" name="Рисунок 169"/>
             <wp:cNvGraphicFramePr>
               <a:graphicFrameLocks xmlns:a="http://schemas.openxmlformats.org/drawingml/2006/main" noChangeAspect="1"/>
             </wp:cNvGraphicFramePr>
@@ -574,23 +557,36 @@
               <a:graphicData uri="http://schemas.openxmlformats.org/drawingml/2006/picture">
                 <pic:pic xmlns:pic="http://schemas.openxmlformats.org/drawingml/2006/picture">
                   <pic:nvPicPr>
-                    <pic:cNvPr id="1" name=""/>
-                    <pic:cNvPicPr/>
+                    <pic:cNvPr id="0" name="Рисунок 88"/>
+                    <pic:cNvPicPr>
+                      <a:picLocks noChangeAspect="1" noChangeArrowheads="1"/>
+                    </pic:cNvPicPr>
                   </pic:nvPicPr>
                   <pic:blipFill>
-                    <a:blip r:embed="rId12"/>
+                    <a:blip r:embed="rId12">
+                      <a:extLst>
+                        <a:ext uri="{28A0092B-C50C-407E-A947-70E740481C1C}">
+                          <a14:useLocalDpi xmlns:a14="http://schemas.microsoft.com/office/drawing/2010/main" val="0"/>
+                        </a:ext>
+                      </a:extLst>
+                    </a:blip>
+                    <a:srcRect/>
                     <a:stretch>
                       <a:fillRect/>
                     </a:stretch>
                   </pic:blipFill>
-                  <pic:spPr>
+                  <pic:spPr bwMode="auto">
                     <a:xfrm>
                       <a:off x="0" y="0"/>
-                      <a:ext cx="6483350" cy="501650"/>
+                      <a:ext cx="6483350" cy="502920"/>
                     </a:xfrm>
                     <a:prstGeom prst="rect">
                       <a:avLst/>
                     </a:prstGeom>
+                    <a:noFill/>
+                    <a:ln>
+                      <a:noFill/>
+                    </a:ln>
                   </pic:spPr>
                 </pic:pic>
               </a:graphicData>
@@ -613,16 +609,7 @@
         <w:jc w:val="center"/>
       </w:pPr>
       <w:r>
-        <w:t>Рисунок В.</w:t>
-      </w:r>
-      <w:r>
-        <w:t>6</w:t>
-      </w:r>
-      <w:r>
-        <w:t xml:space="preserve"> – </w:t>
-      </w:r>
-      <w:r>
-        <w:t>Інформація про авторизацію</w:t>
+        <w:t>Рисунок 6 – Інформація про авторизацію</w:t>
       </w:r>
     </w:p>
     <w:p>
@@ -650,10 +637,10 @@
           <w:noProof/>
         </w:rPr>
         <w:drawing>
-          <wp:inline distT="0" distB="0" distL="0" distR="0" wp14:anchorId="1BF6B788" wp14:editId="313A9E43">
-            <wp:extent cx="6483350" cy="3210560"/>
-            <wp:effectExtent l="0" t="0" r="0" b="8890"/>
-            <wp:docPr id="89" name="Рисунок 89"/>
+          <wp:inline distT="0" distB="0" distL="0" distR="0">
+            <wp:extent cx="6483350" cy="3207385"/>
+            <wp:effectExtent l="0" t="0" r="0" b="0"/>
+            <wp:docPr id="168" name="Рисунок 168"/>
             <wp:cNvGraphicFramePr>
               <a:graphicFrameLocks xmlns:a="http://schemas.openxmlformats.org/drawingml/2006/main" noChangeAspect="1"/>
             </wp:cNvGraphicFramePr>
@@ -661,23 +648,36 @@
               <a:graphicData uri="http://schemas.openxmlformats.org/drawingml/2006/picture">
                 <pic:pic xmlns:pic="http://schemas.openxmlformats.org/drawingml/2006/picture">
                   <pic:nvPicPr>
-                    <pic:cNvPr id="1" name=""/>
-                    <pic:cNvPicPr/>
+                    <pic:cNvPr id="0" name="Рисунок 89"/>
+                    <pic:cNvPicPr>
+                      <a:picLocks noChangeAspect="1" noChangeArrowheads="1"/>
+                    </pic:cNvPicPr>
                   </pic:nvPicPr>
                   <pic:blipFill>
-                    <a:blip r:embed="rId13"/>
+                    <a:blip r:embed="rId13">
+                      <a:extLst>
+                        <a:ext uri="{28A0092B-C50C-407E-A947-70E740481C1C}">
+                          <a14:useLocalDpi xmlns:a14="http://schemas.microsoft.com/office/drawing/2010/main" val="0"/>
+                        </a:ext>
+                      </a:extLst>
+                    </a:blip>
+                    <a:srcRect/>
                     <a:stretch>
                       <a:fillRect/>
                     </a:stretch>
                   </pic:blipFill>
-                  <pic:spPr>
+                  <pic:spPr bwMode="auto">
                     <a:xfrm>
                       <a:off x="0" y="0"/>
-                      <a:ext cx="6483350" cy="3210560"/>
+                      <a:ext cx="6483350" cy="3207385"/>
                     </a:xfrm>
                     <a:prstGeom prst="rect">
                       <a:avLst/>
                     </a:prstGeom>
+                    <a:noFill/>
+                    <a:ln>
+                      <a:noFill/>
+                    </a:ln>
                   </pic:spPr>
                 </pic:pic>
               </a:graphicData>
@@ -693,13 +693,7 @@
         <w:jc w:val="center"/>
       </w:pPr>
       <w:r>
-        <w:t>Рисунок В.</w:t>
-      </w:r>
-      <w:r>
-        <w:t>7</w:t>
-      </w:r>
-      <w:r>
-        <w:t xml:space="preserve"> – </w:t>
+        <w:t xml:space="preserve">Рисунок 7 – </w:t>
       </w:r>
       <w:proofErr w:type="spellStart"/>
       <w:r>
@@ -740,10 +734,10 @@
         </w:rPr>
         <w:lastRenderedPageBreak/>
         <w:drawing>
-          <wp:inline distT="0" distB="0" distL="0" distR="0" wp14:anchorId="1D3AE914" wp14:editId="436525D0">
-            <wp:extent cx="6483350" cy="3174365"/>
-            <wp:effectExtent l="0" t="0" r="0" b="6985"/>
-            <wp:docPr id="127" name="Рисунок 127"/>
+          <wp:inline distT="0" distB="0" distL="0" distR="0">
+            <wp:extent cx="6256020" cy="3070860"/>
+            <wp:effectExtent l="0" t="0" r="0" b="0"/>
+            <wp:docPr id="167" name="Рисунок 167"/>
             <wp:cNvGraphicFramePr>
               <a:graphicFrameLocks xmlns:a="http://schemas.openxmlformats.org/drawingml/2006/main" noChangeAspect="1"/>
             </wp:cNvGraphicFramePr>
@@ -751,23 +745,36 @@
               <a:graphicData uri="http://schemas.openxmlformats.org/drawingml/2006/picture">
                 <pic:pic xmlns:pic="http://schemas.openxmlformats.org/drawingml/2006/picture">
                   <pic:nvPicPr>
-                    <pic:cNvPr id="1" name=""/>
-                    <pic:cNvPicPr/>
+                    <pic:cNvPr id="0" name="Рисунок 127"/>
+                    <pic:cNvPicPr>
+                      <a:picLocks noChangeAspect="1" noChangeArrowheads="1"/>
+                    </pic:cNvPicPr>
                   </pic:nvPicPr>
                   <pic:blipFill>
-                    <a:blip r:embed="rId14"/>
+                    <a:blip r:embed="rId14">
+                      <a:extLst>
+                        <a:ext uri="{28A0092B-C50C-407E-A947-70E740481C1C}">
+                          <a14:useLocalDpi xmlns:a14="http://schemas.microsoft.com/office/drawing/2010/main" val="0"/>
+                        </a:ext>
+                      </a:extLst>
+                    </a:blip>
+                    <a:srcRect/>
                     <a:stretch>
                       <a:fillRect/>
                     </a:stretch>
                   </pic:blipFill>
-                  <pic:spPr>
+                  <pic:spPr bwMode="auto">
                     <a:xfrm>
                       <a:off x="0" y="0"/>
-                      <a:ext cx="6483350" cy="3174365"/>
+                      <a:ext cx="6256020" cy="3070860"/>
                     </a:xfrm>
                     <a:prstGeom prst="rect">
                       <a:avLst/>
                     </a:prstGeom>
+                    <a:noFill/>
+                    <a:ln>
+                      <a:noFill/>
+                    </a:ln>
                   </pic:spPr>
                 </pic:pic>
               </a:graphicData>
@@ -783,7 +790,7 @@
         <w:jc w:val="center"/>
       </w:pPr>
       <w:r>
-        <w:t>Рисунок В.</w:t>
+        <w:t xml:space="preserve">Рисунок </w:t>
       </w:r>
       <w:r>
         <w:rPr>
@@ -832,10 +839,10 @@
           <w:lang w:val="ru-RU"/>
         </w:rPr>
         <w:drawing>
-          <wp:inline distT="0" distB="0" distL="0" distR="0" wp14:anchorId="7404C0F1" wp14:editId="2250E814">
-            <wp:extent cx="6483350" cy="4936490"/>
+          <wp:inline distT="0" distB="0" distL="0" distR="0">
+            <wp:extent cx="5913120" cy="4503420"/>
             <wp:effectExtent l="0" t="0" r="0" b="0"/>
-            <wp:docPr id="91" name="Рисунок 91"/>
+            <wp:docPr id="166" name="Рисунок 166"/>
             <wp:cNvGraphicFramePr>
               <a:graphicFrameLocks xmlns:a="http://schemas.openxmlformats.org/drawingml/2006/main" noChangeAspect="1"/>
             </wp:cNvGraphicFramePr>
@@ -843,23 +850,36 @@
               <a:graphicData uri="http://schemas.openxmlformats.org/drawingml/2006/picture">
                 <pic:pic xmlns:pic="http://schemas.openxmlformats.org/drawingml/2006/picture">
                   <pic:nvPicPr>
-                    <pic:cNvPr id="1" name=""/>
-                    <pic:cNvPicPr/>
+                    <pic:cNvPr id="0" name="Рисунок 91"/>
+                    <pic:cNvPicPr>
+                      <a:picLocks noChangeAspect="1" noChangeArrowheads="1"/>
+                    </pic:cNvPicPr>
                   </pic:nvPicPr>
                   <pic:blipFill>
-                    <a:blip r:embed="rId15"/>
+                    <a:blip r:embed="rId15">
+                      <a:extLst>
+                        <a:ext uri="{28A0092B-C50C-407E-A947-70E740481C1C}">
+                          <a14:useLocalDpi xmlns:a14="http://schemas.microsoft.com/office/drawing/2010/main" val="0"/>
+                        </a:ext>
+                      </a:extLst>
+                    </a:blip>
+                    <a:srcRect/>
                     <a:stretch>
                       <a:fillRect/>
                     </a:stretch>
                   </pic:blipFill>
-                  <pic:spPr>
+                  <pic:spPr bwMode="auto">
                     <a:xfrm>
                       <a:off x="0" y="0"/>
-                      <a:ext cx="6483350" cy="4936490"/>
+                      <a:ext cx="5913120" cy="4503420"/>
                     </a:xfrm>
                     <a:prstGeom prst="rect">
                       <a:avLst/>
                     </a:prstGeom>
+                    <a:noFill/>
+                    <a:ln>
+                      <a:noFill/>
+                    </a:ln>
                   </pic:spPr>
                 </pic:pic>
               </a:graphicData>
@@ -875,7 +895,7 @@
         <w:jc w:val="center"/>
       </w:pPr>
       <w:r>
-        <w:t>Рисунок В.</w:t>
+        <w:t xml:space="preserve">Рисунок </w:t>
       </w:r>
       <w:r>
         <w:rPr>
@@ -918,10 +938,10 @@
         </w:rPr>
         <w:lastRenderedPageBreak/>
         <w:drawing>
-          <wp:inline distT="0" distB="0" distL="0" distR="0" wp14:anchorId="7F79D0B0" wp14:editId="530BCDB0">
-            <wp:extent cx="6483350" cy="3406140"/>
-            <wp:effectExtent l="0" t="0" r="0" b="3810"/>
-            <wp:docPr id="92" name="Рисунок 92"/>
+          <wp:inline distT="0" distB="0" distL="0" distR="0">
+            <wp:extent cx="6483350" cy="3405505"/>
+            <wp:effectExtent l="0" t="0" r="0" b="4445"/>
+            <wp:docPr id="165" name="Рисунок 165"/>
             <wp:cNvGraphicFramePr>
               <a:graphicFrameLocks xmlns:a="http://schemas.openxmlformats.org/drawingml/2006/main" noChangeAspect="1"/>
             </wp:cNvGraphicFramePr>
@@ -929,23 +949,36 @@
               <a:graphicData uri="http://schemas.openxmlformats.org/drawingml/2006/picture">
                 <pic:pic xmlns:pic="http://schemas.openxmlformats.org/drawingml/2006/picture">
                   <pic:nvPicPr>
-                    <pic:cNvPr id="1" name=""/>
-                    <pic:cNvPicPr/>
+                    <pic:cNvPr id="0" name="Рисунок 92"/>
+                    <pic:cNvPicPr>
+                      <a:picLocks noChangeAspect="1" noChangeArrowheads="1"/>
+                    </pic:cNvPicPr>
                   </pic:nvPicPr>
                   <pic:blipFill>
-                    <a:blip r:embed="rId16"/>
+                    <a:blip r:embed="rId16">
+                      <a:extLst>
+                        <a:ext uri="{28A0092B-C50C-407E-A947-70E740481C1C}">
+                          <a14:useLocalDpi xmlns:a14="http://schemas.microsoft.com/office/drawing/2010/main" val="0"/>
+                        </a:ext>
+                      </a:extLst>
+                    </a:blip>
+                    <a:srcRect/>
                     <a:stretch>
                       <a:fillRect/>
                     </a:stretch>
                   </pic:blipFill>
-                  <pic:spPr>
+                  <pic:spPr bwMode="auto">
                     <a:xfrm>
                       <a:off x="0" y="0"/>
-                      <a:ext cx="6483350" cy="3406140"/>
+                      <a:ext cx="6483350" cy="3405505"/>
                     </a:xfrm>
                     <a:prstGeom prst="rect">
                       <a:avLst/>
                     </a:prstGeom>
+                    <a:noFill/>
+                    <a:ln>
+                      <a:noFill/>
+                    </a:ln>
                   </pic:spPr>
                 </pic:pic>
               </a:graphicData>
@@ -961,7 +994,7 @@
         <w:jc w:val="center"/>
       </w:pPr>
       <w:r>
-        <w:t>Рисунок В.</w:t>
+        <w:t xml:space="preserve">Рисунок </w:t>
       </w:r>
       <w:r>
         <w:rPr>
@@ -1013,10 +1046,10 @@
           <w:lang w:val="ru-RU"/>
         </w:rPr>
         <w:drawing>
-          <wp:inline distT="0" distB="0" distL="0" distR="0" wp14:anchorId="34B11097" wp14:editId="3776E7EF">
-            <wp:extent cx="6483350" cy="2814955"/>
-            <wp:effectExtent l="0" t="0" r="0" b="4445"/>
-            <wp:docPr id="128" name="Рисунок 128"/>
+          <wp:inline distT="0" distB="0" distL="0" distR="0">
+            <wp:extent cx="6483350" cy="2811145"/>
+            <wp:effectExtent l="0" t="0" r="0" b="8255"/>
+            <wp:docPr id="164" name="Рисунок 164"/>
             <wp:cNvGraphicFramePr>
               <a:graphicFrameLocks xmlns:a="http://schemas.openxmlformats.org/drawingml/2006/main" noChangeAspect="1"/>
             </wp:cNvGraphicFramePr>
@@ -1024,23 +1057,36 @@
               <a:graphicData uri="http://schemas.openxmlformats.org/drawingml/2006/picture">
                 <pic:pic xmlns:pic="http://schemas.openxmlformats.org/drawingml/2006/picture">
                   <pic:nvPicPr>
-                    <pic:cNvPr id="1" name=""/>
-                    <pic:cNvPicPr/>
+                    <pic:cNvPr id="0" name="Рисунок 128"/>
+                    <pic:cNvPicPr>
+                      <a:picLocks noChangeAspect="1" noChangeArrowheads="1"/>
+                    </pic:cNvPicPr>
                   </pic:nvPicPr>
                   <pic:blipFill>
-                    <a:blip r:embed="rId17"/>
+                    <a:blip r:embed="rId17">
+                      <a:extLst>
+                        <a:ext uri="{28A0092B-C50C-407E-A947-70E740481C1C}">
+                          <a14:useLocalDpi xmlns:a14="http://schemas.microsoft.com/office/drawing/2010/main" val="0"/>
+                        </a:ext>
+                      </a:extLst>
+                    </a:blip>
+                    <a:srcRect/>
                     <a:stretch>
                       <a:fillRect/>
                     </a:stretch>
                   </pic:blipFill>
-                  <pic:spPr>
+                  <pic:spPr bwMode="auto">
                     <a:xfrm>
                       <a:off x="0" y="0"/>
-                      <a:ext cx="6483350" cy="2814955"/>
+                      <a:ext cx="6483350" cy="2811145"/>
                     </a:xfrm>
                     <a:prstGeom prst="rect">
                       <a:avLst/>
                     </a:prstGeom>
+                    <a:noFill/>
+                    <a:ln>
+                      <a:noFill/>
+                    </a:ln>
                   </pic:spPr>
                 </pic:pic>
               </a:graphicData>
@@ -1056,7 +1102,7 @@
         <w:jc w:val="center"/>
       </w:pPr>
       <w:r>
-        <w:t>Рисунок В.</w:t>
+        <w:t xml:space="preserve">Рисунок </w:t>
       </w:r>
       <w:r>
         <w:rPr>
@@ -1080,14 +1126,6 @@
       <w:pPr>
         <w:pStyle w:val="a3"/>
         <w:spacing w:line="360" w:lineRule="auto"/>
-        <w:jc w:val="center"/>
-      </w:pPr>
-    </w:p>
-    <w:p>
-      <w:pPr>
-        <w:pStyle w:val="a3"/>
-        <w:spacing w:line="360" w:lineRule="auto"/>
-        <w:jc w:val="center"/>
       </w:pPr>
     </w:p>
     <w:p>
@@ -1106,10 +1144,10 @@
         </w:rPr>
         <w:lastRenderedPageBreak/>
         <w:drawing>
-          <wp:inline distT="0" distB="0" distL="0" distR="0" wp14:anchorId="6AB47820" wp14:editId="28663B3D">
-            <wp:extent cx="6483350" cy="2621280"/>
-            <wp:effectExtent l="0" t="0" r="0" b="7620"/>
-            <wp:docPr id="94" name="Рисунок 94"/>
+          <wp:inline distT="0" distB="0" distL="0" distR="0">
+            <wp:extent cx="6483350" cy="2620645"/>
+            <wp:effectExtent l="0" t="0" r="0" b="8255"/>
+            <wp:docPr id="163" name="Рисунок 163"/>
             <wp:cNvGraphicFramePr>
               <a:graphicFrameLocks xmlns:a="http://schemas.openxmlformats.org/drawingml/2006/main" noChangeAspect="1"/>
             </wp:cNvGraphicFramePr>
@@ -1117,23 +1155,36 @@
               <a:graphicData uri="http://schemas.openxmlformats.org/drawingml/2006/picture">
                 <pic:pic xmlns:pic="http://schemas.openxmlformats.org/drawingml/2006/picture">
                   <pic:nvPicPr>
-                    <pic:cNvPr id="1" name=""/>
-                    <pic:cNvPicPr/>
+                    <pic:cNvPr id="0" name="Рисунок 94"/>
+                    <pic:cNvPicPr>
+                      <a:picLocks noChangeAspect="1" noChangeArrowheads="1"/>
+                    </pic:cNvPicPr>
                   </pic:nvPicPr>
                   <pic:blipFill>
-                    <a:blip r:embed="rId18"/>
+                    <a:blip r:embed="rId18">
+                      <a:extLst>
+                        <a:ext uri="{28A0092B-C50C-407E-A947-70E740481C1C}">
+                          <a14:useLocalDpi xmlns:a14="http://schemas.microsoft.com/office/drawing/2010/main" val="0"/>
+                        </a:ext>
+                      </a:extLst>
+                    </a:blip>
+                    <a:srcRect/>
                     <a:stretch>
                       <a:fillRect/>
                     </a:stretch>
                   </pic:blipFill>
-                  <pic:spPr>
+                  <pic:spPr bwMode="auto">
                     <a:xfrm>
                       <a:off x="0" y="0"/>
-                      <a:ext cx="6483350" cy="2621280"/>
+                      <a:ext cx="6483350" cy="2620645"/>
                     </a:xfrm>
                     <a:prstGeom prst="rect">
                       <a:avLst/>
                     </a:prstGeom>
+                    <a:noFill/>
+                    <a:ln>
+                      <a:noFill/>
+                    </a:ln>
                   </pic:spPr>
                 </pic:pic>
               </a:graphicData>
@@ -1149,7 +1200,7 @@
         <w:jc w:val="center"/>
       </w:pPr>
       <w:r>
-        <w:t>Рисунок В.</w:t>
+        <w:t xml:space="preserve">Рисунок </w:t>
       </w:r>
       <w:r>
         <w:rPr>
@@ -1166,10 +1217,7 @@
       </w:r>
       <w:proofErr w:type="spellEnd"/>
       <w:r>
-        <w:t xml:space="preserve"> для </w:t>
-      </w:r>
-      <w:r>
-        <w:t>пошуку гри</w:t>
+        <w:t xml:space="preserve"> для пошуку гри</w:t>
       </w:r>
     </w:p>
     <w:p>
@@ -1193,10 +1241,10 @@
           <w:lang w:val="ru-RU"/>
         </w:rPr>
         <w:drawing>
-          <wp:inline distT="0" distB="0" distL="0" distR="0" wp14:anchorId="6430A38E" wp14:editId="524D9C29">
-            <wp:extent cx="6483350" cy="2077720"/>
+          <wp:inline distT="0" distB="0" distL="0" distR="0">
+            <wp:extent cx="6483350" cy="2079625"/>
             <wp:effectExtent l="0" t="0" r="0" b="0"/>
-            <wp:docPr id="95" name="Рисунок 95"/>
+            <wp:docPr id="162" name="Рисунок 162"/>
             <wp:cNvGraphicFramePr>
               <a:graphicFrameLocks xmlns:a="http://schemas.openxmlformats.org/drawingml/2006/main" noChangeAspect="1"/>
             </wp:cNvGraphicFramePr>
@@ -1204,23 +1252,36 @@
               <a:graphicData uri="http://schemas.openxmlformats.org/drawingml/2006/picture">
                 <pic:pic xmlns:pic="http://schemas.openxmlformats.org/drawingml/2006/picture">
                   <pic:nvPicPr>
-                    <pic:cNvPr id="1" name=""/>
-                    <pic:cNvPicPr/>
+                    <pic:cNvPr id="0" name="Рисунок 95"/>
+                    <pic:cNvPicPr>
+                      <a:picLocks noChangeAspect="1" noChangeArrowheads="1"/>
+                    </pic:cNvPicPr>
                   </pic:nvPicPr>
                   <pic:blipFill>
-                    <a:blip r:embed="rId19"/>
+                    <a:blip r:embed="rId19">
+                      <a:extLst>
+                        <a:ext uri="{28A0092B-C50C-407E-A947-70E740481C1C}">
+                          <a14:useLocalDpi xmlns:a14="http://schemas.microsoft.com/office/drawing/2010/main" val="0"/>
+                        </a:ext>
+                      </a:extLst>
+                    </a:blip>
+                    <a:srcRect/>
                     <a:stretch>
                       <a:fillRect/>
                     </a:stretch>
                   </pic:blipFill>
-                  <pic:spPr>
+                  <pic:spPr bwMode="auto">
                     <a:xfrm>
                       <a:off x="0" y="0"/>
-                      <a:ext cx="6483350" cy="2077720"/>
+                      <a:ext cx="6483350" cy="2079625"/>
                     </a:xfrm>
                     <a:prstGeom prst="rect">
                       <a:avLst/>
                     </a:prstGeom>
+                    <a:noFill/>
+                    <a:ln>
+                      <a:noFill/>
+                    </a:ln>
                   </pic:spPr>
                 </pic:pic>
               </a:graphicData>
@@ -1249,7 +1310,7 @@
         </w:rPr>
       </w:pPr>
       <w:r>
-        <w:t>Рисунок В.</w:t>
+        <w:t xml:space="preserve">Рисунок </w:t>
       </w:r>
       <w:r>
         <w:rPr>
@@ -1299,10 +1360,10 @@
           <w:noProof/>
         </w:rPr>
         <w:drawing>
-          <wp:inline distT="0" distB="0" distL="0" distR="0" wp14:anchorId="66D3D4D6" wp14:editId="3A2DF8E1">
+          <wp:inline distT="0" distB="0" distL="0" distR="0">
             <wp:extent cx="6483350" cy="3131185"/>
             <wp:effectExtent l="0" t="0" r="0" b="0"/>
-            <wp:docPr id="96" name="Рисунок 96"/>
+            <wp:docPr id="161" name="Рисунок 161"/>
             <wp:cNvGraphicFramePr>
               <a:graphicFrameLocks xmlns:a="http://schemas.openxmlformats.org/drawingml/2006/main" noChangeAspect="1"/>
             </wp:cNvGraphicFramePr>
@@ -1310,16 +1371,25 @@
               <a:graphicData uri="http://schemas.openxmlformats.org/drawingml/2006/picture">
                 <pic:pic xmlns:pic="http://schemas.openxmlformats.org/drawingml/2006/picture">
                   <pic:nvPicPr>
-                    <pic:cNvPr id="1" name=""/>
-                    <pic:cNvPicPr/>
+                    <pic:cNvPr id="0" name="Рисунок 96"/>
+                    <pic:cNvPicPr>
+                      <a:picLocks noChangeAspect="1" noChangeArrowheads="1"/>
+                    </pic:cNvPicPr>
                   </pic:nvPicPr>
                   <pic:blipFill>
-                    <a:blip r:embed="rId20"/>
+                    <a:blip r:embed="rId20">
+                      <a:extLst>
+                        <a:ext uri="{28A0092B-C50C-407E-A947-70E740481C1C}">
+                          <a14:useLocalDpi xmlns:a14="http://schemas.microsoft.com/office/drawing/2010/main" val="0"/>
+                        </a:ext>
+                      </a:extLst>
+                    </a:blip>
+                    <a:srcRect/>
                     <a:stretch>
                       <a:fillRect/>
                     </a:stretch>
                   </pic:blipFill>
-                  <pic:spPr>
+                  <pic:spPr bwMode="auto">
                     <a:xfrm>
                       <a:off x="0" y="0"/>
                       <a:ext cx="6483350" cy="3131185"/>
@@ -1327,6 +1397,10 @@
                     <a:prstGeom prst="rect">
                       <a:avLst/>
                     </a:prstGeom>
+                    <a:noFill/>
+                    <a:ln>
+                      <a:noFill/>
+                    </a:ln>
                   </pic:spPr>
                 </pic:pic>
               </a:graphicData>
@@ -1342,7 +1416,7 @@
         <w:jc w:val="center"/>
       </w:pPr>
       <w:r>
-        <w:t>Рисунок В.</w:t>
+        <w:t xml:space="preserve">Рисунок </w:t>
       </w:r>
       <w:r>
         <w:rPr>
@@ -1384,10 +1458,10 @@
           <w:lang w:val="ru-RU"/>
         </w:rPr>
         <w:drawing>
-          <wp:inline distT="0" distB="0" distL="0" distR="0" wp14:anchorId="19404CD2" wp14:editId="181BA0A8">
-            <wp:extent cx="6483350" cy="2938145"/>
+          <wp:inline distT="0" distB="0" distL="0" distR="0">
+            <wp:extent cx="6483350" cy="2940685"/>
             <wp:effectExtent l="0" t="0" r="0" b="0"/>
-            <wp:docPr id="97" name="Рисунок 97"/>
+            <wp:docPr id="160" name="Рисунок 160"/>
             <wp:cNvGraphicFramePr>
               <a:graphicFrameLocks xmlns:a="http://schemas.openxmlformats.org/drawingml/2006/main" noChangeAspect="1"/>
             </wp:cNvGraphicFramePr>
@@ -1395,23 +1469,36 @@
               <a:graphicData uri="http://schemas.openxmlformats.org/drawingml/2006/picture">
                 <pic:pic xmlns:pic="http://schemas.openxmlformats.org/drawingml/2006/picture">
                   <pic:nvPicPr>
-                    <pic:cNvPr id="1" name=""/>
-                    <pic:cNvPicPr/>
+                    <pic:cNvPr id="0" name="Рисунок 97"/>
+                    <pic:cNvPicPr>
+                      <a:picLocks noChangeAspect="1" noChangeArrowheads="1"/>
+                    </pic:cNvPicPr>
                   </pic:nvPicPr>
                   <pic:blipFill>
-                    <a:blip r:embed="rId21"/>
+                    <a:blip r:embed="rId21">
+                      <a:extLst>
+                        <a:ext uri="{28A0092B-C50C-407E-A947-70E740481C1C}">
+                          <a14:useLocalDpi xmlns:a14="http://schemas.microsoft.com/office/drawing/2010/main" val="0"/>
+                        </a:ext>
+                      </a:extLst>
+                    </a:blip>
+                    <a:srcRect/>
                     <a:stretch>
                       <a:fillRect/>
                     </a:stretch>
                   </pic:blipFill>
-                  <pic:spPr>
+                  <pic:spPr bwMode="auto">
                     <a:xfrm>
                       <a:off x="0" y="0"/>
-                      <a:ext cx="6483350" cy="2938145"/>
+                      <a:ext cx="6483350" cy="2940685"/>
                     </a:xfrm>
                     <a:prstGeom prst="rect">
                       <a:avLst/>
                     </a:prstGeom>
+                    <a:noFill/>
+                    <a:ln>
+                      <a:noFill/>
+                    </a:ln>
                   </pic:spPr>
                 </pic:pic>
               </a:graphicData>
@@ -1430,7 +1517,7 @@
         </w:rPr>
       </w:pPr>
       <w:r>
-        <w:t xml:space="preserve">Рисунок В.15 – </w:t>
+        <w:t xml:space="preserve">Рисунок 15 – </w:t>
       </w:r>
       <w:proofErr w:type="spellStart"/>
       <w:r>
@@ -1456,10 +1543,10 @@
           <w:lang w:val="ru-RU"/>
         </w:rPr>
         <w:drawing>
-          <wp:inline distT="0" distB="0" distL="0" distR="0" wp14:anchorId="53BDE455" wp14:editId="169D3D49">
-            <wp:extent cx="6483350" cy="3205480"/>
+          <wp:inline distT="0" distB="0" distL="0" distR="0">
+            <wp:extent cx="6483350" cy="3207385"/>
             <wp:effectExtent l="0" t="0" r="0" b="0"/>
-            <wp:docPr id="98" name="Рисунок 98"/>
+            <wp:docPr id="159" name="Рисунок 159"/>
             <wp:cNvGraphicFramePr>
               <a:graphicFrameLocks xmlns:a="http://schemas.openxmlformats.org/drawingml/2006/main" noChangeAspect="1"/>
             </wp:cNvGraphicFramePr>
@@ -1467,23 +1554,36 @@
               <a:graphicData uri="http://schemas.openxmlformats.org/drawingml/2006/picture">
                 <pic:pic xmlns:pic="http://schemas.openxmlformats.org/drawingml/2006/picture">
                   <pic:nvPicPr>
-                    <pic:cNvPr id="1" name=""/>
-                    <pic:cNvPicPr/>
+                    <pic:cNvPr id="0" name="Рисунок 98"/>
+                    <pic:cNvPicPr>
+                      <a:picLocks noChangeAspect="1" noChangeArrowheads="1"/>
+                    </pic:cNvPicPr>
                   </pic:nvPicPr>
                   <pic:blipFill>
-                    <a:blip r:embed="rId22"/>
+                    <a:blip r:embed="rId22">
+                      <a:extLst>
+                        <a:ext uri="{28A0092B-C50C-407E-A947-70E740481C1C}">
+                          <a14:useLocalDpi xmlns:a14="http://schemas.microsoft.com/office/drawing/2010/main" val="0"/>
+                        </a:ext>
+                      </a:extLst>
+                    </a:blip>
+                    <a:srcRect/>
                     <a:stretch>
                       <a:fillRect/>
                     </a:stretch>
                   </pic:blipFill>
-                  <pic:spPr>
+                  <pic:spPr bwMode="auto">
                     <a:xfrm>
                       <a:off x="0" y="0"/>
-                      <a:ext cx="6483350" cy="3205480"/>
+                      <a:ext cx="6483350" cy="3207385"/>
                     </a:xfrm>
                     <a:prstGeom prst="rect">
                       <a:avLst/>
                     </a:prstGeom>
+                    <a:noFill/>
+                    <a:ln>
+                      <a:noFill/>
+                    </a:ln>
                   </pic:spPr>
                 </pic:pic>
               </a:graphicData>
@@ -1502,7 +1602,7 @@
         </w:rPr>
       </w:pPr>
       <w:r>
-        <w:t xml:space="preserve">Рисунок В.16 – </w:t>
+        <w:t xml:space="preserve">Рисунок 16 – </w:t>
       </w:r>
       <w:proofErr w:type="spellStart"/>
       <w:r>
@@ -1539,10 +1639,10 @@
         </w:rPr>
         <w:lastRenderedPageBreak/>
         <w:drawing>
-          <wp:inline distT="0" distB="0" distL="0" distR="0" wp14:anchorId="3CC5026D" wp14:editId="3C0794D1">
-            <wp:extent cx="6483350" cy="4209415"/>
-            <wp:effectExtent l="0" t="0" r="0" b="635"/>
-            <wp:docPr id="99" name="Рисунок 99"/>
+          <wp:inline distT="0" distB="0" distL="0" distR="0">
+            <wp:extent cx="6483350" cy="4213225"/>
+            <wp:effectExtent l="0" t="0" r="0" b="0"/>
+            <wp:docPr id="158" name="Рисунок 158"/>
             <wp:cNvGraphicFramePr>
               <a:graphicFrameLocks xmlns:a="http://schemas.openxmlformats.org/drawingml/2006/main" noChangeAspect="1"/>
             </wp:cNvGraphicFramePr>
@@ -1550,23 +1650,36 @@
               <a:graphicData uri="http://schemas.openxmlformats.org/drawingml/2006/picture">
                 <pic:pic xmlns:pic="http://schemas.openxmlformats.org/drawingml/2006/picture">
                   <pic:nvPicPr>
-                    <pic:cNvPr id="1" name=""/>
-                    <pic:cNvPicPr/>
+                    <pic:cNvPr id="0" name="Рисунок 99"/>
+                    <pic:cNvPicPr>
+                      <a:picLocks noChangeAspect="1" noChangeArrowheads="1"/>
+                    </pic:cNvPicPr>
                   </pic:nvPicPr>
                   <pic:blipFill>
-                    <a:blip r:embed="rId23"/>
+                    <a:blip r:embed="rId23">
+                      <a:extLst>
+                        <a:ext uri="{28A0092B-C50C-407E-A947-70E740481C1C}">
+                          <a14:useLocalDpi xmlns:a14="http://schemas.microsoft.com/office/drawing/2010/main" val="0"/>
+                        </a:ext>
+                      </a:extLst>
+                    </a:blip>
+                    <a:srcRect/>
                     <a:stretch>
                       <a:fillRect/>
                     </a:stretch>
                   </pic:blipFill>
-                  <pic:spPr>
+                  <pic:spPr bwMode="auto">
                     <a:xfrm>
                       <a:off x="0" y="0"/>
-                      <a:ext cx="6483350" cy="4209415"/>
+                      <a:ext cx="6483350" cy="4213225"/>
                     </a:xfrm>
                     <a:prstGeom prst="rect">
                       <a:avLst/>
                     </a:prstGeom>
+                    <a:noFill/>
+                    <a:ln>
+                      <a:noFill/>
+                    </a:ln>
                   </pic:spPr>
                 </pic:pic>
               </a:graphicData>
@@ -1585,7 +1698,7 @@
         </w:rPr>
       </w:pPr>
       <w:r>
-        <w:t xml:space="preserve">Рисунок В.17 – </w:t>
+        <w:t xml:space="preserve">Рисунок 17 – </w:t>
       </w:r>
       <w:proofErr w:type="spellStart"/>
       <w:r>
@@ -1629,10 +1742,10 @@
           <w:lang w:val="ru-RU"/>
         </w:rPr>
         <w:drawing>
-          <wp:inline distT="0" distB="0" distL="0" distR="0" wp14:anchorId="5E6EFD73" wp14:editId="51CA1968">
-            <wp:extent cx="6483350" cy="3157220"/>
-            <wp:effectExtent l="0" t="0" r="0" b="5080"/>
-            <wp:docPr id="100" name="Рисунок 100"/>
+          <wp:inline distT="0" distB="0" distL="0" distR="0">
+            <wp:extent cx="6477000" cy="3154680"/>
+            <wp:effectExtent l="0" t="0" r="0" b="7620"/>
+            <wp:docPr id="157" name="Рисунок 157"/>
             <wp:cNvGraphicFramePr>
               <a:graphicFrameLocks xmlns:a="http://schemas.openxmlformats.org/drawingml/2006/main" noChangeAspect="1"/>
             </wp:cNvGraphicFramePr>
@@ -1640,23 +1753,36 @@
               <a:graphicData uri="http://schemas.openxmlformats.org/drawingml/2006/picture">
                 <pic:pic xmlns:pic="http://schemas.openxmlformats.org/drawingml/2006/picture">
                   <pic:nvPicPr>
-                    <pic:cNvPr id="1" name=""/>
-                    <pic:cNvPicPr/>
+                    <pic:cNvPr id="0" name="Рисунок 100"/>
+                    <pic:cNvPicPr>
+                      <a:picLocks noChangeAspect="1" noChangeArrowheads="1"/>
+                    </pic:cNvPicPr>
                   </pic:nvPicPr>
                   <pic:blipFill>
-                    <a:blip r:embed="rId24"/>
+                    <a:blip r:embed="rId24">
+                      <a:extLst>
+                        <a:ext uri="{28A0092B-C50C-407E-A947-70E740481C1C}">
+                          <a14:useLocalDpi xmlns:a14="http://schemas.microsoft.com/office/drawing/2010/main" val="0"/>
+                        </a:ext>
+                      </a:extLst>
+                    </a:blip>
+                    <a:srcRect/>
                     <a:stretch>
                       <a:fillRect/>
                     </a:stretch>
                   </pic:blipFill>
-                  <pic:spPr>
+                  <pic:spPr bwMode="auto">
                     <a:xfrm>
                       <a:off x="0" y="0"/>
-                      <a:ext cx="6483350" cy="3157220"/>
+                      <a:ext cx="6477000" cy="3154680"/>
                     </a:xfrm>
                     <a:prstGeom prst="rect">
                       <a:avLst/>
                     </a:prstGeom>
+                    <a:noFill/>
+                    <a:ln>
+                      <a:noFill/>
+                    </a:ln>
                   </pic:spPr>
                 </pic:pic>
               </a:graphicData>
@@ -1672,7 +1798,7 @@
         <w:jc w:val="center"/>
       </w:pPr>
       <w:r>
-        <w:t xml:space="preserve">Рисунок В.18 – </w:t>
+        <w:t xml:space="preserve">Рисунок 18 – </w:t>
       </w:r>
       <w:proofErr w:type="spellStart"/>
       <w:r>
@@ -1717,10 +1843,10 @@
         </w:rPr>
         <w:lastRenderedPageBreak/>
         <w:drawing>
-          <wp:inline distT="0" distB="0" distL="0" distR="0" wp14:anchorId="33447260" wp14:editId="7F77193C">
-            <wp:extent cx="6483350" cy="3184525"/>
-            <wp:effectExtent l="0" t="0" r="0" b="0"/>
-            <wp:docPr id="101" name="Рисунок 101"/>
+          <wp:inline distT="0" distB="0" distL="0" distR="0">
+            <wp:extent cx="6483350" cy="3180715"/>
+            <wp:effectExtent l="0" t="0" r="0" b="635"/>
+            <wp:docPr id="156" name="Рисунок 156"/>
             <wp:cNvGraphicFramePr>
               <a:graphicFrameLocks xmlns:a="http://schemas.openxmlformats.org/drawingml/2006/main" noChangeAspect="1"/>
             </wp:cNvGraphicFramePr>
@@ -1728,23 +1854,36 @@
               <a:graphicData uri="http://schemas.openxmlformats.org/drawingml/2006/picture">
                 <pic:pic xmlns:pic="http://schemas.openxmlformats.org/drawingml/2006/picture">
                   <pic:nvPicPr>
-                    <pic:cNvPr id="1" name=""/>
-                    <pic:cNvPicPr/>
+                    <pic:cNvPr id="0" name="Рисунок 101"/>
+                    <pic:cNvPicPr>
+                      <a:picLocks noChangeAspect="1" noChangeArrowheads="1"/>
+                    </pic:cNvPicPr>
                   </pic:nvPicPr>
                   <pic:blipFill>
-                    <a:blip r:embed="rId25"/>
+                    <a:blip r:embed="rId25">
+                      <a:extLst>
+                        <a:ext uri="{28A0092B-C50C-407E-A947-70E740481C1C}">
+                          <a14:useLocalDpi xmlns:a14="http://schemas.microsoft.com/office/drawing/2010/main" val="0"/>
+                        </a:ext>
+                      </a:extLst>
+                    </a:blip>
+                    <a:srcRect/>
                     <a:stretch>
                       <a:fillRect/>
                     </a:stretch>
                   </pic:blipFill>
-                  <pic:spPr>
+                  <pic:spPr bwMode="auto">
                     <a:xfrm>
                       <a:off x="0" y="0"/>
-                      <a:ext cx="6483350" cy="3184525"/>
+                      <a:ext cx="6483350" cy="3180715"/>
                     </a:xfrm>
                     <a:prstGeom prst="rect">
                       <a:avLst/>
                     </a:prstGeom>
+                    <a:noFill/>
+                    <a:ln>
+                      <a:noFill/>
+                    </a:ln>
                   </pic:spPr>
                 </pic:pic>
               </a:graphicData>
@@ -1760,7 +1899,7 @@
         <w:jc w:val="center"/>
       </w:pPr>
       <w:r>
-        <w:t xml:space="preserve">Рисунок В.19 – </w:t>
+        <w:t xml:space="preserve">Рисунок 19 – </w:t>
       </w:r>
       <w:proofErr w:type="spellStart"/>
       <w:r>
@@ -1804,10 +1943,10 @@
           <w:lang w:val="ru-RU"/>
         </w:rPr>
         <w:drawing>
-          <wp:inline distT="0" distB="0" distL="0" distR="0" wp14:anchorId="1B17E451" wp14:editId="1D3BABAA">
-            <wp:extent cx="6483350" cy="3217545"/>
-            <wp:effectExtent l="0" t="0" r="0" b="1905"/>
-            <wp:docPr id="102" name="Рисунок 102"/>
+          <wp:inline distT="0" distB="0" distL="0" distR="0">
+            <wp:extent cx="6483350" cy="3218815"/>
+            <wp:effectExtent l="0" t="0" r="0" b="635"/>
+            <wp:docPr id="155" name="Рисунок 155"/>
             <wp:cNvGraphicFramePr>
               <a:graphicFrameLocks xmlns:a="http://schemas.openxmlformats.org/drawingml/2006/main" noChangeAspect="1"/>
             </wp:cNvGraphicFramePr>
@@ -1815,23 +1954,36 @@
               <a:graphicData uri="http://schemas.openxmlformats.org/drawingml/2006/picture">
                 <pic:pic xmlns:pic="http://schemas.openxmlformats.org/drawingml/2006/picture">
                   <pic:nvPicPr>
-                    <pic:cNvPr id="1" name=""/>
-                    <pic:cNvPicPr/>
+                    <pic:cNvPr id="0" name="Рисунок 102"/>
+                    <pic:cNvPicPr>
+                      <a:picLocks noChangeAspect="1" noChangeArrowheads="1"/>
+                    </pic:cNvPicPr>
                   </pic:nvPicPr>
                   <pic:blipFill>
-                    <a:blip r:embed="rId26"/>
+                    <a:blip r:embed="rId26">
+                      <a:extLst>
+                        <a:ext uri="{28A0092B-C50C-407E-A947-70E740481C1C}">
+                          <a14:useLocalDpi xmlns:a14="http://schemas.microsoft.com/office/drawing/2010/main" val="0"/>
+                        </a:ext>
+                      </a:extLst>
+                    </a:blip>
+                    <a:srcRect/>
                     <a:stretch>
                       <a:fillRect/>
                     </a:stretch>
                   </pic:blipFill>
-                  <pic:spPr>
+                  <pic:spPr bwMode="auto">
                     <a:xfrm>
                       <a:off x="0" y="0"/>
-                      <a:ext cx="6483350" cy="3217545"/>
+                      <a:ext cx="6483350" cy="3218815"/>
                     </a:xfrm>
                     <a:prstGeom prst="rect">
                       <a:avLst/>
                     </a:prstGeom>
+                    <a:noFill/>
+                    <a:ln>
+                      <a:noFill/>
+                    </a:ln>
                   </pic:spPr>
                 </pic:pic>
               </a:graphicData>
@@ -1850,7 +2002,7 @@
         </w:rPr>
       </w:pPr>
       <w:r>
-        <w:t xml:space="preserve">Рисунок В.20 – </w:t>
+        <w:t xml:space="preserve">Рисунок 20 – </w:t>
       </w:r>
       <w:proofErr w:type="spellStart"/>
       <w:r>
@@ -1895,10 +2047,10 @@
         </w:rPr>
         <w:lastRenderedPageBreak/>
         <w:drawing>
-          <wp:inline distT="0" distB="0" distL="0" distR="0" wp14:anchorId="4B30DCD4" wp14:editId="55DEDFCC">
-            <wp:extent cx="6483350" cy="3192780"/>
-            <wp:effectExtent l="0" t="0" r="0" b="7620"/>
-            <wp:docPr id="103" name="Рисунок 103"/>
+          <wp:inline distT="0" distB="0" distL="0" distR="0">
+            <wp:extent cx="6483350" cy="3192145"/>
+            <wp:effectExtent l="0" t="0" r="0" b="8255"/>
+            <wp:docPr id="154" name="Рисунок 154"/>
             <wp:cNvGraphicFramePr>
               <a:graphicFrameLocks xmlns:a="http://schemas.openxmlformats.org/drawingml/2006/main" noChangeAspect="1"/>
             </wp:cNvGraphicFramePr>
@@ -1906,23 +2058,36 @@
               <a:graphicData uri="http://schemas.openxmlformats.org/drawingml/2006/picture">
                 <pic:pic xmlns:pic="http://schemas.openxmlformats.org/drawingml/2006/picture">
                   <pic:nvPicPr>
-                    <pic:cNvPr id="1" name=""/>
-                    <pic:cNvPicPr/>
+                    <pic:cNvPr id="0" name="Рисунок 103"/>
+                    <pic:cNvPicPr>
+                      <a:picLocks noChangeAspect="1" noChangeArrowheads="1"/>
+                    </pic:cNvPicPr>
                   </pic:nvPicPr>
                   <pic:blipFill>
-                    <a:blip r:embed="rId27"/>
+                    <a:blip r:embed="rId27">
+                      <a:extLst>
+                        <a:ext uri="{28A0092B-C50C-407E-A947-70E740481C1C}">
+                          <a14:useLocalDpi xmlns:a14="http://schemas.microsoft.com/office/drawing/2010/main" val="0"/>
+                        </a:ext>
+                      </a:extLst>
+                    </a:blip>
+                    <a:srcRect/>
                     <a:stretch>
                       <a:fillRect/>
                     </a:stretch>
                   </pic:blipFill>
-                  <pic:spPr>
+                  <pic:spPr bwMode="auto">
                     <a:xfrm>
                       <a:off x="0" y="0"/>
-                      <a:ext cx="6483350" cy="3192780"/>
+                      <a:ext cx="6483350" cy="3192145"/>
                     </a:xfrm>
                     <a:prstGeom prst="rect">
                       <a:avLst/>
                     </a:prstGeom>
+                    <a:noFill/>
+                    <a:ln>
+                      <a:noFill/>
+                    </a:ln>
                   </pic:spPr>
                 </pic:pic>
               </a:graphicData>
@@ -1938,7 +2103,7 @@
         <w:jc w:val="center"/>
       </w:pPr>
       <w:r>
-        <w:t xml:space="preserve">Рисунок В.21 – </w:t>
+        <w:t xml:space="preserve">Рисунок 21 – </w:t>
       </w:r>
       <w:proofErr w:type="spellStart"/>
       <w:r>
@@ -1979,10 +2144,10 @@
           <w:lang w:val="ru-RU"/>
         </w:rPr>
         <w:drawing>
-          <wp:inline distT="0" distB="0" distL="0" distR="0" wp14:anchorId="2AAB0406" wp14:editId="295EEDEE">
-            <wp:extent cx="6483350" cy="4012565"/>
-            <wp:effectExtent l="0" t="0" r="0" b="6985"/>
-            <wp:docPr id="104" name="Рисунок 104"/>
+          <wp:inline distT="0" distB="0" distL="0" distR="0">
+            <wp:extent cx="6483350" cy="4015105"/>
+            <wp:effectExtent l="0" t="0" r="0" b="4445"/>
+            <wp:docPr id="153" name="Рисунок 153"/>
             <wp:cNvGraphicFramePr>
               <a:graphicFrameLocks xmlns:a="http://schemas.openxmlformats.org/drawingml/2006/main" noChangeAspect="1"/>
             </wp:cNvGraphicFramePr>
@@ -1990,23 +2155,36 @@
               <a:graphicData uri="http://schemas.openxmlformats.org/drawingml/2006/picture">
                 <pic:pic xmlns:pic="http://schemas.openxmlformats.org/drawingml/2006/picture">
                   <pic:nvPicPr>
-                    <pic:cNvPr id="1" name=""/>
-                    <pic:cNvPicPr/>
+                    <pic:cNvPr id="0" name="Рисунок 104"/>
+                    <pic:cNvPicPr>
+                      <a:picLocks noChangeAspect="1" noChangeArrowheads="1"/>
+                    </pic:cNvPicPr>
                   </pic:nvPicPr>
                   <pic:blipFill>
-                    <a:blip r:embed="rId28"/>
+                    <a:blip r:embed="rId28">
+                      <a:extLst>
+                        <a:ext uri="{28A0092B-C50C-407E-A947-70E740481C1C}">
+                          <a14:useLocalDpi xmlns:a14="http://schemas.microsoft.com/office/drawing/2010/main" val="0"/>
+                        </a:ext>
+                      </a:extLst>
+                    </a:blip>
+                    <a:srcRect/>
                     <a:stretch>
                       <a:fillRect/>
                     </a:stretch>
                   </pic:blipFill>
-                  <pic:spPr>
+                  <pic:spPr bwMode="auto">
                     <a:xfrm>
                       <a:off x="0" y="0"/>
-                      <a:ext cx="6483350" cy="4012565"/>
+                      <a:ext cx="6483350" cy="4015105"/>
                     </a:xfrm>
                     <a:prstGeom prst="rect">
                       <a:avLst/>
                     </a:prstGeom>
+                    <a:noFill/>
+                    <a:ln>
+                      <a:noFill/>
+                    </a:ln>
                   </pic:spPr>
                 </pic:pic>
               </a:graphicData>
@@ -2025,7 +2203,7 @@
         </w:rPr>
       </w:pPr>
       <w:r>
-        <w:t xml:space="preserve">Рисунок В.22 – </w:t>
+        <w:t xml:space="preserve">Рисунок 22 – </w:t>
       </w:r>
       <w:proofErr w:type="spellStart"/>
       <w:r>
@@ -2067,10 +2245,10 @@
         </w:rPr>
         <w:lastRenderedPageBreak/>
         <w:drawing>
-          <wp:inline distT="0" distB="0" distL="0" distR="0" wp14:anchorId="1782202C" wp14:editId="7FF91F9B">
-            <wp:extent cx="6483350" cy="2882900"/>
+          <wp:inline distT="0" distB="0" distL="0" distR="0">
+            <wp:extent cx="6483350" cy="2879725"/>
             <wp:effectExtent l="0" t="0" r="0" b="0"/>
-            <wp:docPr id="105" name="Рисунок 105"/>
+            <wp:docPr id="152" name="Рисунок 152"/>
             <wp:cNvGraphicFramePr>
               <a:graphicFrameLocks xmlns:a="http://schemas.openxmlformats.org/drawingml/2006/main" noChangeAspect="1"/>
             </wp:cNvGraphicFramePr>
@@ -2078,23 +2256,36 @@
               <a:graphicData uri="http://schemas.openxmlformats.org/drawingml/2006/picture">
                 <pic:pic xmlns:pic="http://schemas.openxmlformats.org/drawingml/2006/picture">
                   <pic:nvPicPr>
-                    <pic:cNvPr id="1" name=""/>
-                    <pic:cNvPicPr/>
+                    <pic:cNvPr id="0" name="Рисунок 105"/>
+                    <pic:cNvPicPr>
+                      <a:picLocks noChangeAspect="1" noChangeArrowheads="1"/>
+                    </pic:cNvPicPr>
                   </pic:nvPicPr>
                   <pic:blipFill>
-                    <a:blip r:embed="rId29"/>
+                    <a:blip r:embed="rId29">
+                      <a:extLst>
+                        <a:ext uri="{28A0092B-C50C-407E-A947-70E740481C1C}">
+                          <a14:useLocalDpi xmlns:a14="http://schemas.microsoft.com/office/drawing/2010/main" val="0"/>
+                        </a:ext>
+                      </a:extLst>
+                    </a:blip>
+                    <a:srcRect/>
                     <a:stretch>
                       <a:fillRect/>
                     </a:stretch>
                   </pic:blipFill>
-                  <pic:spPr>
+                  <pic:spPr bwMode="auto">
                     <a:xfrm>
                       <a:off x="0" y="0"/>
-                      <a:ext cx="6483350" cy="2882900"/>
+                      <a:ext cx="6483350" cy="2879725"/>
                     </a:xfrm>
                     <a:prstGeom prst="rect">
                       <a:avLst/>
                     </a:prstGeom>
+                    <a:noFill/>
+                    <a:ln>
+                      <a:noFill/>
+                    </a:ln>
                   </pic:spPr>
                 </pic:pic>
               </a:graphicData>
@@ -2110,7 +2301,7 @@
         <w:jc w:val="center"/>
       </w:pPr>
       <w:r>
-        <w:t xml:space="preserve">Рисунок В.23 – </w:t>
+        <w:t xml:space="preserve">Рисунок 23 – </w:t>
       </w:r>
       <w:proofErr w:type="spellStart"/>
       <w:r>
@@ -2151,10 +2342,10 @@
           <w:lang w:val="ru-RU"/>
         </w:rPr>
         <w:drawing>
-          <wp:inline distT="0" distB="0" distL="0" distR="0" wp14:anchorId="2FF36D9D" wp14:editId="21E60428">
-            <wp:extent cx="6483350" cy="3301365"/>
+          <wp:inline distT="0" distB="0" distL="0" distR="0">
+            <wp:extent cx="6483350" cy="3298825"/>
             <wp:effectExtent l="0" t="0" r="0" b="0"/>
-            <wp:docPr id="106" name="Рисунок 106"/>
+            <wp:docPr id="151" name="Рисунок 151"/>
             <wp:cNvGraphicFramePr>
               <a:graphicFrameLocks xmlns:a="http://schemas.openxmlformats.org/drawingml/2006/main" noChangeAspect="1"/>
             </wp:cNvGraphicFramePr>
@@ -2162,23 +2353,36 @@
               <a:graphicData uri="http://schemas.openxmlformats.org/drawingml/2006/picture">
                 <pic:pic xmlns:pic="http://schemas.openxmlformats.org/drawingml/2006/picture">
                   <pic:nvPicPr>
-                    <pic:cNvPr id="1" name=""/>
-                    <pic:cNvPicPr/>
+                    <pic:cNvPr id="0" name="Рисунок 106"/>
+                    <pic:cNvPicPr>
+                      <a:picLocks noChangeAspect="1" noChangeArrowheads="1"/>
+                    </pic:cNvPicPr>
                   </pic:nvPicPr>
                   <pic:blipFill>
-                    <a:blip r:embed="rId30"/>
+                    <a:blip r:embed="rId30">
+                      <a:extLst>
+                        <a:ext uri="{28A0092B-C50C-407E-A947-70E740481C1C}">
+                          <a14:useLocalDpi xmlns:a14="http://schemas.microsoft.com/office/drawing/2010/main" val="0"/>
+                        </a:ext>
+                      </a:extLst>
+                    </a:blip>
+                    <a:srcRect/>
                     <a:stretch>
                       <a:fillRect/>
                     </a:stretch>
                   </pic:blipFill>
-                  <pic:spPr>
+                  <pic:spPr bwMode="auto">
                     <a:xfrm>
                       <a:off x="0" y="0"/>
-                      <a:ext cx="6483350" cy="3301365"/>
+                      <a:ext cx="6483350" cy="3298825"/>
                     </a:xfrm>
                     <a:prstGeom prst="rect">
                       <a:avLst/>
                     </a:prstGeom>
+                    <a:noFill/>
+                    <a:ln>
+                      <a:noFill/>
+                    </a:ln>
                   </pic:spPr>
                 </pic:pic>
               </a:graphicData>
@@ -2197,7 +2401,7 @@
         </w:rPr>
       </w:pPr>
       <w:r>
-        <w:t xml:space="preserve">Рисунок В.24 – </w:t>
+        <w:t xml:space="preserve">Рисунок 24 – </w:t>
       </w:r>
       <w:proofErr w:type="spellStart"/>
       <w:r>
@@ -2239,10 +2443,10 @@
         </w:rPr>
         <w:lastRenderedPageBreak/>
         <w:drawing>
-          <wp:inline distT="0" distB="0" distL="0" distR="0" wp14:anchorId="2F48EBB9" wp14:editId="1871C498">
-            <wp:extent cx="6483350" cy="2457450"/>
-            <wp:effectExtent l="0" t="0" r="0" b="0"/>
-            <wp:docPr id="107" name="Рисунок 107"/>
+          <wp:inline distT="0" distB="0" distL="0" distR="0">
+            <wp:extent cx="6483350" cy="2450465"/>
+            <wp:effectExtent l="0" t="0" r="0" b="6985"/>
+            <wp:docPr id="150" name="Рисунок 150"/>
             <wp:cNvGraphicFramePr>
               <a:graphicFrameLocks xmlns:a="http://schemas.openxmlformats.org/drawingml/2006/main" noChangeAspect="1"/>
             </wp:cNvGraphicFramePr>
@@ -2250,23 +2454,36 @@
               <a:graphicData uri="http://schemas.openxmlformats.org/drawingml/2006/picture">
                 <pic:pic xmlns:pic="http://schemas.openxmlformats.org/drawingml/2006/picture">
                   <pic:nvPicPr>
-                    <pic:cNvPr id="1" name=""/>
-                    <pic:cNvPicPr/>
+                    <pic:cNvPr id="0" name="Рисунок 107"/>
+                    <pic:cNvPicPr>
+                      <a:picLocks noChangeAspect="1" noChangeArrowheads="1"/>
+                    </pic:cNvPicPr>
                   </pic:nvPicPr>
                   <pic:blipFill>
-                    <a:blip r:embed="rId31"/>
+                    <a:blip r:embed="rId31">
+                      <a:extLst>
+                        <a:ext uri="{28A0092B-C50C-407E-A947-70E740481C1C}">
+                          <a14:useLocalDpi xmlns:a14="http://schemas.microsoft.com/office/drawing/2010/main" val="0"/>
+                        </a:ext>
+                      </a:extLst>
+                    </a:blip>
+                    <a:srcRect/>
                     <a:stretch>
                       <a:fillRect/>
                     </a:stretch>
                   </pic:blipFill>
-                  <pic:spPr>
+                  <pic:spPr bwMode="auto">
                     <a:xfrm>
                       <a:off x="0" y="0"/>
-                      <a:ext cx="6483350" cy="2457450"/>
+                      <a:ext cx="6483350" cy="2450465"/>
                     </a:xfrm>
                     <a:prstGeom prst="rect">
                       <a:avLst/>
                     </a:prstGeom>
+                    <a:noFill/>
+                    <a:ln>
+                      <a:noFill/>
+                    </a:ln>
                   </pic:spPr>
                 </pic:pic>
               </a:graphicData>
@@ -2282,7 +2499,7 @@
         <w:jc w:val="center"/>
       </w:pPr>
       <w:r>
-        <w:t xml:space="preserve">Рисунок В.25 – </w:t>
+        <w:t xml:space="preserve">Рисунок 25 – </w:t>
       </w:r>
       <w:proofErr w:type="spellStart"/>
       <w:r>
@@ -2326,10 +2543,10 @@
           <w:lang w:val="ru-RU"/>
         </w:rPr>
         <w:drawing>
-          <wp:inline distT="0" distB="0" distL="0" distR="0" wp14:anchorId="084BA82D" wp14:editId="4610A8A1">
-            <wp:extent cx="6483350" cy="4645660"/>
-            <wp:effectExtent l="0" t="0" r="0" b="2540"/>
-            <wp:docPr id="108" name="Рисунок 108"/>
+          <wp:inline distT="0" distB="0" distL="0" distR="0">
+            <wp:extent cx="6073140" cy="4351020"/>
+            <wp:effectExtent l="0" t="0" r="3810" b="0"/>
+            <wp:docPr id="149" name="Рисунок 149"/>
             <wp:cNvGraphicFramePr>
               <a:graphicFrameLocks xmlns:a="http://schemas.openxmlformats.org/drawingml/2006/main" noChangeAspect="1"/>
             </wp:cNvGraphicFramePr>
@@ -2337,23 +2554,36 @@
               <a:graphicData uri="http://schemas.openxmlformats.org/drawingml/2006/picture">
                 <pic:pic xmlns:pic="http://schemas.openxmlformats.org/drawingml/2006/picture">
                   <pic:nvPicPr>
-                    <pic:cNvPr id="1" name=""/>
-                    <pic:cNvPicPr/>
+                    <pic:cNvPr id="0" name="Рисунок 108"/>
+                    <pic:cNvPicPr>
+                      <a:picLocks noChangeAspect="1" noChangeArrowheads="1"/>
+                    </pic:cNvPicPr>
                   </pic:nvPicPr>
                   <pic:blipFill>
-                    <a:blip r:embed="rId32"/>
+                    <a:blip r:embed="rId32">
+                      <a:extLst>
+                        <a:ext uri="{28A0092B-C50C-407E-A947-70E740481C1C}">
+                          <a14:useLocalDpi xmlns:a14="http://schemas.microsoft.com/office/drawing/2010/main" val="0"/>
+                        </a:ext>
+                      </a:extLst>
+                    </a:blip>
+                    <a:srcRect/>
                     <a:stretch>
                       <a:fillRect/>
                     </a:stretch>
                   </pic:blipFill>
-                  <pic:spPr>
+                  <pic:spPr bwMode="auto">
                     <a:xfrm>
                       <a:off x="0" y="0"/>
-                      <a:ext cx="6483350" cy="4645660"/>
+                      <a:ext cx="6073140" cy="4351020"/>
                     </a:xfrm>
                     <a:prstGeom prst="rect">
                       <a:avLst/>
                     </a:prstGeom>
+                    <a:noFill/>
+                    <a:ln>
+                      <a:noFill/>
+                    </a:ln>
                   </pic:spPr>
                 </pic:pic>
               </a:graphicData>
@@ -2372,7 +2602,7 @@
         </w:rPr>
       </w:pPr>
       <w:r>
-        <w:t xml:space="preserve">Рисунок В.26 – </w:t>
+        <w:t xml:space="preserve">Рисунок 26 – </w:t>
       </w:r>
       <w:proofErr w:type="spellStart"/>
       <w:r>
@@ -2409,10 +2639,10 @@
         </w:rPr>
         <w:lastRenderedPageBreak/>
         <w:drawing>
-          <wp:inline distT="0" distB="0" distL="0" distR="0" wp14:anchorId="0A9B3177" wp14:editId="4644E5AA">
-            <wp:extent cx="6483350" cy="4251960"/>
-            <wp:effectExtent l="0" t="0" r="0" b="0"/>
-            <wp:docPr id="109" name="Рисунок 109"/>
+          <wp:inline distT="0" distB="0" distL="0" distR="0">
+            <wp:extent cx="5890260" cy="3863340"/>
+            <wp:effectExtent l="0" t="0" r="0" b="3810"/>
+            <wp:docPr id="148" name="Рисунок 148"/>
             <wp:cNvGraphicFramePr>
               <a:graphicFrameLocks xmlns:a="http://schemas.openxmlformats.org/drawingml/2006/main" noChangeAspect="1"/>
             </wp:cNvGraphicFramePr>
@@ -2420,23 +2650,36 @@
               <a:graphicData uri="http://schemas.openxmlformats.org/drawingml/2006/picture">
                 <pic:pic xmlns:pic="http://schemas.openxmlformats.org/drawingml/2006/picture">
                   <pic:nvPicPr>
-                    <pic:cNvPr id="1" name=""/>
-                    <pic:cNvPicPr/>
+                    <pic:cNvPr id="0" name="Рисунок 109"/>
+                    <pic:cNvPicPr>
+                      <a:picLocks noChangeAspect="1" noChangeArrowheads="1"/>
+                    </pic:cNvPicPr>
                   </pic:nvPicPr>
                   <pic:blipFill>
-                    <a:blip r:embed="rId33"/>
+                    <a:blip r:embed="rId33">
+                      <a:extLst>
+                        <a:ext uri="{28A0092B-C50C-407E-A947-70E740481C1C}">
+                          <a14:useLocalDpi xmlns:a14="http://schemas.microsoft.com/office/drawing/2010/main" val="0"/>
+                        </a:ext>
+                      </a:extLst>
+                    </a:blip>
+                    <a:srcRect/>
                     <a:stretch>
                       <a:fillRect/>
                     </a:stretch>
                   </pic:blipFill>
-                  <pic:spPr>
+                  <pic:spPr bwMode="auto">
                     <a:xfrm>
                       <a:off x="0" y="0"/>
-                      <a:ext cx="6483350" cy="4251960"/>
+                      <a:ext cx="5890260" cy="3863340"/>
                     </a:xfrm>
                     <a:prstGeom prst="rect">
                       <a:avLst/>
                     </a:prstGeom>
+                    <a:noFill/>
+                    <a:ln>
+                      <a:noFill/>
+                    </a:ln>
                   </pic:spPr>
                 </pic:pic>
               </a:graphicData>
@@ -2450,12 +2693,9 @@
         <w:pStyle w:val="a3"/>
         <w:spacing w:line="360" w:lineRule="auto"/>
         <w:jc w:val="center"/>
-        <w:rPr>
-          <w:lang w:val="ru-RU"/>
-        </w:rPr>
-      </w:pPr>
-      <w:r>
-        <w:t xml:space="preserve">Рисунок В.27 – </w:t>
+      </w:pPr>
+      <w:r>
+        <w:t xml:space="preserve">Рисунок 27 – </w:t>
       </w:r>
       <w:proofErr w:type="spellStart"/>
       <w:r>
@@ -2491,10 +2731,10 @@
           <w:lang w:val="ru-RU"/>
         </w:rPr>
         <w:drawing>
-          <wp:inline distT="0" distB="0" distL="0" distR="0" wp14:anchorId="6A8CF7BF" wp14:editId="1C29C907">
-            <wp:extent cx="6483350" cy="3111500"/>
+          <wp:inline distT="0" distB="0" distL="0" distR="0">
+            <wp:extent cx="6483350" cy="3108325"/>
             <wp:effectExtent l="0" t="0" r="0" b="0"/>
-            <wp:docPr id="110" name="Рисунок 110"/>
+            <wp:docPr id="147" name="Рисунок 147"/>
             <wp:cNvGraphicFramePr>
               <a:graphicFrameLocks xmlns:a="http://schemas.openxmlformats.org/drawingml/2006/main" noChangeAspect="1"/>
             </wp:cNvGraphicFramePr>
@@ -2502,23 +2742,36 @@
               <a:graphicData uri="http://schemas.openxmlformats.org/drawingml/2006/picture">
                 <pic:pic xmlns:pic="http://schemas.openxmlformats.org/drawingml/2006/picture">
                   <pic:nvPicPr>
-                    <pic:cNvPr id="1" name=""/>
-                    <pic:cNvPicPr/>
+                    <pic:cNvPr id="0" name="Рисунок 110"/>
+                    <pic:cNvPicPr>
+                      <a:picLocks noChangeAspect="1" noChangeArrowheads="1"/>
+                    </pic:cNvPicPr>
                   </pic:nvPicPr>
                   <pic:blipFill>
-                    <a:blip r:embed="rId34"/>
+                    <a:blip r:embed="rId34">
+                      <a:extLst>
+                        <a:ext uri="{28A0092B-C50C-407E-A947-70E740481C1C}">
+                          <a14:useLocalDpi xmlns:a14="http://schemas.microsoft.com/office/drawing/2010/main" val="0"/>
+                        </a:ext>
+                      </a:extLst>
+                    </a:blip>
+                    <a:srcRect/>
                     <a:stretch>
                       <a:fillRect/>
                     </a:stretch>
                   </pic:blipFill>
-                  <pic:spPr>
+                  <pic:spPr bwMode="auto">
                     <a:xfrm>
                       <a:off x="0" y="0"/>
-                      <a:ext cx="6483350" cy="3111500"/>
+                      <a:ext cx="6483350" cy="3108325"/>
                     </a:xfrm>
                     <a:prstGeom prst="rect">
                       <a:avLst/>
                     </a:prstGeom>
+                    <a:noFill/>
+                    <a:ln>
+                      <a:noFill/>
+                    </a:ln>
                   </pic:spPr>
                 </pic:pic>
               </a:graphicData>
@@ -2537,7 +2790,7 @@
         </w:rPr>
       </w:pPr>
       <w:r>
-        <w:t xml:space="preserve">Рисунок В.28 – </w:t>
+        <w:t xml:space="preserve">Рисунок 28 – </w:t>
       </w:r>
       <w:proofErr w:type="spellStart"/>
       <w:r>
@@ -2574,10 +2827,10 @@
         </w:rPr>
         <w:lastRenderedPageBreak/>
         <w:drawing>
-          <wp:inline distT="0" distB="0" distL="0" distR="0" wp14:anchorId="6E630A80" wp14:editId="1C2C6C2F">
-            <wp:extent cx="6483350" cy="4403090"/>
-            <wp:effectExtent l="0" t="0" r="0" b="0"/>
-            <wp:docPr id="111" name="Рисунок 111"/>
+          <wp:inline distT="0" distB="0" distL="0" distR="0">
+            <wp:extent cx="6483350" cy="4398645"/>
+            <wp:effectExtent l="0" t="0" r="0" b="1905"/>
+            <wp:docPr id="146" name="Рисунок 146"/>
             <wp:cNvGraphicFramePr>
               <a:graphicFrameLocks xmlns:a="http://schemas.openxmlformats.org/drawingml/2006/main" noChangeAspect="1"/>
             </wp:cNvGraphicFramePr>
@@ -2585,23 +2838,36 @@
               <a:graphicData uri="http://schemas.openxmlformats.org/drawingml/2006/picture">
                 <pic:pic xmlns:pic="http://schemas.openxmlformats.org/drawingml/2006/picture">
                   <pic:nvPicPr>
-                    <pic:cNvPr id="1" name=""/>
-                    <pic:cNvPicPr/>
+                    <pic:cNvPr id="0" name="Рисунок 111"/>
+                    <pic:cNvPicPr>
+                      <a:picLocks noChangeAspect="1" noChangeArrowheads="1"/>
+                    </pic:cNvPicPr>
                   </pic:nvPicPr>
                   <pic:blipFill>
-                    <a:blip r:embed="rId35"/>
+                    <a:blip r:embed="rId35">
+                      <a:extLst>
+                        <a:ext uri="{28A0092B-C50C-407E-A947-70E740481C1C}">
+                          <a14:useLocalDpi xmlns:a14="http://schemas.microsoft.com/office/drawing/2010/main" val="0"/>
+                        </a:ext>
+                      </a:extLst>
+                    </a:blip>
+                    <a:srcRect/>
                     <a:stretch>
                       <a:fillRect/>
                     </a:stretch>
                   </pic:blipFill>
-                  <pic:spPr>
+                  <pic:spPr bwMode="auto">
                     <a:xfrm>
                       <a:off x="0" y="0"/>
-                      <a:ext cx="6483350" cy="4403090"/>
+                      <a:ext cx="6483350" cy="4398645"/>
                     </a:xfrm>
                     <a:prstGeom prst="rect">
                       <a:avLst/>
                     </a:prstGeom>
+                    <a:noFill/>
+                    <a:ln>
+                      <a:noFill/>
+                    </a:ln>
                   </pic:spPr>
                 </pic:pic>
               </a:graphicData>
@@ -2620,7 +2886,7 @@
         </w:rPr>
       </w:pPr>
       <w:r>
-        <w:t xml:space="preserve">Рисунок В.29 – </w:t>
+        <w:t xml:space="preserve">Рисунок 29 – </w:t>
       </w:r>
       <w:proofErr w:type="spellStart"/>
       <w:r>
@@ -2664,10 +2930,10 @@
           <w:lang w:val="ru-RU"/>
         </w:rPr>
         <w:drawing>
-          <wp:inline distT="0" distB="0" distL="0" distR="0" wp14:anchorId="03CFDAC1" wp14:editId="6110A0BE">
-            <wp:extent cx="6483350" cy="4156075"/>
+          <wp:inline distT="0" distB="0" distL="0" distR="0">
+            <wp:extent cx="5943600" cy="3810000"/>
             <wp:effectExtent l="0" t="0" r="0" b="0"/>
-            <wp:docPr id="112" name="Рисунок 112"/>
+            <wp:docPr id="145" name="Рисунок 145"/>
             <wp:cNvGraphicFramePr>
               <a:graphicFrameLocks xmlns:a="http://schemas.openxmlformats.org/drawingml/2006/main" noChangeAspect="1"/>
             </wp:cNvGraphicFramePr>
@@ -2675,23 +2941,36 @@
               <a:graphicData uri="http://schemas.openxmlformats.org/drawingml/2006/picture">
                 <pic:pic xmlns:pic="http://schemas.openxmlformats.org/drawingml/2006/picture">
                   <pic:nvPicPr>
-                    <pic:cNvPr id="1" name=""/>
-                    <pic:cNvPicPr/>
+                    <pic:cNvPr id="0" name="Рисунок 112"/>
+                    <pic:cNvPicPr>
+                      <a:picLocks noChangeAspect="1" noChangeArrowheads="1"/>
+                    </pic:cNvPicPr>
                   </pic:nvPicPr>
                   <pic:blipFill>
-                    <a:blip r:embed="rId36"/>
+                    <a:blip r:embed="rId36">
+                      <a:extLst>
+                        <a:ext uri="{28A0092B-C50C-407E-A947-70E740481C1C}">
+                          <a14:useLocalDpi xmlns:a14="http://schemas.microsoft.com/office/drawing/2010/main" val="0"/>
+                        </a:ext>
+                      </a:extLst>
+                    </a:blip>
+                    <a:srcRect/>
                     <a:stretch>
                       <a:fillRect/>
                     </a:stretch>
                   </pic:blipFill>
-                  <pic:spPr>
+                  <pic:spPr bwMode="auto">
                     <a:xfrm>
                       <a:off x="0" y="0"/>
-                      <a:ext cx="6483350" cy="4156075"/>
+                      <a:ext cx="5943600" cy="3810000"/>
                     </a:xfrm>
                     <a:prstGeom prst="rect">
                       <a:avLst/>
                     </a:prstGeom>
+                    <a:noFill/>
+                    <a:ln>
+                      <a:noFill/>
+                    </a:ln>
                   </pic:spPr>
                 </pic:pic>
               </a:graphicData>
@@ -2710,7 +2989,7 @@
         </w:rPr>
       </w:pPr>
       <w:r>
-        <w:t xml:space="preserve">Рисунок В.30 – </w:t>
+        <w:t xml:space="preserve">Рисунок 30 – </w:t>
       </w:r>
       <w:proofErr w:type="spellStart"/>
       <w:r>
@@ -2752,10 +3031,10 @@
         </w:rPr>
         <w:lastRenderedPageBreak/>
         <w:drawing>
-          <wp:inline distT="0" distB="0" distL="0" distR="0" wp14:anchorId="115B2E4B" wp14:editId="1C88E776">
-            <wp:extent cx="6483350" cy="4870450"/>
-            <wp:effectExtent l="0" t="0" r="0" b="6350"/>
-            <wp:docPr id="113" name="Рисунок 113"/>
+          <wp:inline distT="0" distB="0" distL="0" distR="0">
+            <wp:extent cx="5638800" cy="4236720"/>
+            <wp:effectExtent l="0" t="0" r="0" b="0"/>
+            <wp:docPr id="144" name="Рисунок 144"/>
             <wp:cNvGraphicFramePr>
               <a:graphicFrameLocks xmlns:a="http://schemas.openxmlformats.org/drawingml/2006/main" noChangeAspect="1"/>
             </wp:cNvGraphicFramePr>
@@ -2763,23 +3042,36 @@
               <a:graphicData uri="http://schemas.openxmlformats.org/drawingml/2006/picture">
                 <pic:pic xmlns:pic="http://schemas.openxmlformats.org/drawingml/2006/picture">
                   <pic:nvPicPr>
-                    <pic:cNvPr id="1" name=""/>
-                    <pic:cNvPicPr/>
+                    <pic:cNvPr id="0" name="Рисунок 113"/>
+                    <pic:cNvPicPr>
+                      <a:picLocks noChangeAspect="1" noChangeArrowheads="1"/>
+                    </pic:cNvPicPr>
                   </pic:nvPicPr>
                   <pic:blipFill>
-                    <a:blip r:embed="rId37"/>
+                    <a:blip r:embed="rId37">
+                      <a:extLst>
+                        <a:ext uri="{28A0092B-C50C-407E-A947-70E740481C1C}">
+                          <a14:useLocalDpi xmlns:a14="http://schemas.microsoft.com/office/drawing/2010/main" val="0"/>
+                        </a:ext>
+                      </a:extLst>
+                    </a:blip>
+                    <a:srcRect/>
                     <a:stretch>
                       <a:fillRect/>
                     </a:stretch>
                   </pic:blipFill>
-                  <pic:spPr>
+                  <pic:spPr bwMode="auto">
                     <a:xfrm>
                       <a:off x="0" y="0"/>
-                      <a:ext cx="6483350" cy="4870450"/>
+                      <a:ext cx="5638800" cy="4236720"/>
                     </a:xfrm>
                     <a:prstGeom prst="rect">
                       <a:avLst/>
                     </a:prstGeom>
+                    <a:noFill/>
+                    <a:ln>
+                      <a:noFill/>
+                    </a:ln>
                   </pic:spPr>
                 </pic:pic>
               </a:graphicData>
@@ -2793,12 +3085,9 @@
         <w:pStyle w:val="a3"/>
         <w:spacing w:line="360" w:lineRule="auto"/>
         <w:jc w:val="center"/>
-        <w:rPr>
-          <w:lang w:val="ru-RU"/>
-        </w:rPr>
-      </w:pPr>
-      <w:r>
-        <w:t xml:space="preserve">Рисунок В.31 – </w:t>
+      </w:pPr>
+      <w:r>
+        <w:t xml:space="preserve">Рисунок 31 – </w:t>
       </w:r>
       <w:proofErr w:type="spellStart"/>
       <w:r>
@@ -2834,10 +3123,10 @@
           <w:lang w:val="ru-RU"/>
         </w:rPr>
         <w:drawing>
-          <wp:inline distT="0" distB="0" distL="0" distR="0" wp14:anchorId="58FF032F" wp14:editId="59E0198C">
-            <wp:extent cx="6483350" cy="3314700"/>
-            <wp:effectExtent l="0" t="0" r="0" b="0"/>
-            <wp:docPr id="114" name="Рисунок 114"/>
+          <wp:inline distT="0" distB="0" distL="0" distR="0">
+            <wp:extent cx="6483350" cy="3310255"/>
+            <wp:effectExtent l="0" t="0" r="0" b="4445"/>
+            <wp:docPr id="143" name="Рисунок 143"/>
             <wp:cNvGraphicFramePr>
               <a:graphicFrameLocks xmlns:a="http://schemas.openxmlformats.org/drawingml/2006/main" noChangeAspect="1"/>
             </wp:cNvGraphicFramePr>
@@ -2845,23 +3134,36 @@
               <a:graphicData uri="http://schemas.openxmlformats.org/drawingml/2006/picture">
                 <pic:pic xmlns:pic="http://schemas.openxmlformats.org/drawingml/2006/picture">
                   <pic:nvPicPr>
-                    <pic:cNvPr id="1" name=""/>
-                    <pic:cNvPicPr/>
+                    <pic:cNvPr id="0" name="Рисунок 114"/>
+                    <pic:cNvPicPr>
+                      <a:picLocks noChangeAspect="1" noChangeArrowheads="1"/>
+                    </pic:cNvPicPr>
                   </pic:nvPicPr>
                   <pic:blipFill>
-                    <a:blip r:embed="rId38"/>
+                    <a:blip r:embed="rId38">
+                      <a:extLst>
+                        <a:ext uri="{28A0092B-C50C-407E-A947-70E740481C1C}">
+                          <a14:useLocalDpi xmlns:a14="http://schemas.microsoft.com/office/drawing/2010/main" val="0"/>
+                        </a:ext>
+                      </a:extLst>
+                    </a:blip>
+                    <a:srcRect/>
                     <a:stretch>
                       <a:fillRect/>
                     </a:stretch>
                   </pic:blipFill>
-                  <pic:spPr>
+                  <pic:spPr bwMode="auto">
                     <a:xfrm>
                       <a:off x="0" y="0"/>
-                      <a:ext cx="6483350" cy="3314700"/>
+                      <a:ext cx="6483350" cy="3310255"/>
                     </a:xfrm>
                     <a:prstGeom prst="rect">
                       <a:avLst/>
                     </a:prstGeom>
+                    <a:noFill/>
+                    <a:ln>
+                      <a:noFill/>
+                    </a:ln>
                   </pic:spPr>
                 </pic:pic>
               </a:graphicData>
@@ -2880,7 +3182,7 @@
         </w:rPr>
       </w:pPr>
       <w:r>
-        <w:t xml:space="preserve">Рисунок В.32 – </w:t>
+        <w:t xml:space="preserve">Рисунок 32 – </w:t>
       </w:r>
       <w:proofErr w:type="spellStart"/>
       <w:r>
@@ -2917,10 +3219,10 @@
         </w:rPr>
         <w:lastRenderedPageBreak/>
         <w:drawing>
-          <wp:inline distT="0" distB="0" distL="0" distR="0" wp14:anchorId="2501E414" wp14:editId="7FA2FE85">
-            <wp:extent cx="6483350" cy="3932555"/>
+          <wp:inline distT="0" distB="0" distL="0" distR="0">
+            <wp:extent cx="6483350" cy="3931285"/>
             <wp:effectExtent l="0" t="0" r="0" b="0"/>
-            <wp:docPr id="115" name="Рисунок 115"/>
+            <wp:docPr id="142" name="Рисунок 142"/>
             <wp:cNvGraphicFramePr>
               <a:graphicFrameLocks xmlns:a="http://schemas.openxmlformats.org/drawingml/2006/main" noChangeAspect="1"/>
             </wp:cNvGraphicFramePr>
@@ -2928,23 +3230,36 @@
               <a:graphicData uri="http://schemas.openxmlformats.org/drawingml/2006/picture">
                 <pic:pic xmlns:pic="http://schemas.openxmlformats.org/drawingml/2006/picture">
                   <pic:nvPicPr>
-                    <pic:cNvPr id="1" name=""/>
-                    <pic:cNvPicPr/>
+                    <pic:cNvPr id="0" name="Рисунок 115"/>
+                    <pic:cNvPicPr>
+                      <a:picLocks noChangeAspect="1" noChangeArrowheads="1"/>
+                    </pic:cNvPicPr>
                   </pic:nvPicPr>
                   <pic:blipFill>
-                    <a:blip r:embed="rId39"/>
+                    <a:blip r:embed="rId39">
+                      <a:extLst>
+                        <a:ext uri="{28A0092B-C50C-407E-A947-70E740481C1C}">
+                          <a14:useLocalDpi xmlns:a14="http://schemas.microsoft.com/office/drawing/2010/main" val="0"/>
+                        </a:ext>
+                      </a:extLst>
+                    </a:blip>
+                    <a:srcRect/>
                     <a:stretch>
                       <a:fillRect/>
                     </a:stretch>
                   </pic:blipFill>
-                  <pic:spPr>
+                  <pic:spPr bwMode="auto">
                     <a:xfrm>
                       <a:off x="0" y="0"/>
-                      <a:ext cx="6483350" cy="3932555"/>
+                      <a:ext cx="6483350" cy="3931285"/>
                     </a:xfrm>
                     <a:prstGeom prst="rect">
                       <a:avLst/>
                     </a:prstGeom>
+                    <a:noFill/>
+                    <a:ln>
+                      <a:noFill/>
+                    </a:ln>
                   </pic:spPr>
                 </pic:pic>
               </a:graphicData>
@@ -2963,7 +3278,7 @@
         </w:rPr>
       </w:pPr>
       <w:r>
-        <w:t xml:space="preserve">Рисунок В.33 – </w:t>
+        <w:t xml:space="preserve">Рисунок 33 – </w:t>
       </w:r>
       <w:proofErr w:type="spellStart"/>
       <w:r>
@@ -2999,10 +3314,10 @@
           <w:lang w:val="ru-RU"/>
         </w:rPr>
         <w:drawing>
-          <wp:inline distT="0" distB="0" distL="0" distR="0" wp14:anchorId="2ECE00A9" wp14:editId="0F7128B5">
-            <wp:extent cx="6483350" cy="4017010"/>
-            <wp:effectExtent l="0" t="0" r="0" b="2540"/>
-            <wp:docPr id="116" name="Рисунок 116"/>
+          <wp:inline distT="0" distB="0" distL="0" distR="0">
+            <wp:extent cx="6483350" cy="4015105"/>
+            <wp:effectExtent l="0" t="0" r="0" b="4445"/>
+            <wp:docPr id="141" name="Рисунок 141"/>
             <wp:cNvGraphicFramePr>
               <a:graphicFrameLocks xmlns:a="http://schemas.openxmlformats.org/drawingml/2006/main" noChangeAspect="1"/>
             </wp:cNvGraphicFramePr>
@@ -3010,23 +3325,36 @@
               <a:graphicData uri="http://schemas.openxmlformats.org/drawingml/2006/picture">
                 <pic:pic xmlns:pic="http://schemas.openxmlformats.org/drawingml/2006/picture">
                   <pic:nvPicPr>
-                    <pic:cNvPr id="1" name=""/>
-                    <pic:cNvPicPr/>
+                    <pic:cNvPr id="0" name="Рисунок 116"/>
+                    <pic:cNvPicPr>
+                      <a:picLocks noChangeAspect="1" noChangeArrowheads="1"/>
+                    </pic:cNvPicPr>
                   </pic:nvPicPr>
                   <pic:blipFill>
-                    <a:blip r:embed="rId40"/>
+                    <a:blip r:embed="rId40">
+                      <a:extLst>
+                        <a:ext uri="{28A0092B-C50C-407E-A947-70E740481C1C}">
+                          <a14:useLocalDpi xmlns:a14="http://schemas.microsoft.com/office/drawing/2010/main" val="0"/>
+                        </a:ext>
+                      </a:extLst>
+                    </a:blip>
+                    <a:srcRect/>
                     <a:stretch>
                       <a:fillRect/>
                     </a:stretch>
                   </pic:blipFill>
-                  <pic:spPr>
+                  <pic:spPr bwMode="auto">
                     <a:xfrm>
                       <a:off x="0" y="0"/>
-                      <a:ext cx="6483350" cy="4017010"/>
+                      <a:ext cx="6483350" cy="4015105"/>
                     </a:xfrm>
                     <a:prstGeom prst="rect">
                       <a:avLst/>
                     </a:prstGeom>
+                    <a:noFill/>
+                    <a:ln>
+                      <a:noFill/>
+                    </a:ln>
                   </pic:spPr>
                 </pic:pic>
               </a:graphicData>
@@ -3045,7 +3373,7 @@
         </w:rPr>
       </w:pPr>
       <w:r>
-        <w:t xml:space="preserve">Рисунок В.34 – </w:t>
+        <w:t xml:space="preserve">Рисунок 34 – </w:t>
       </w:r>
       <w:proofErr w:type="spellStart"/>
       <w:r>
@@ -3082,10 +3410,10 @@
         </w:rPr>
         <w:lastRenderedPageBreak/>
         <w:drawing>
-          <wp:inline distT="0" distB="0" distL="0" distR="0" wp14:anchorId="010D9B42" wp14:editId="4A22550A">
-            <wp:extent cx="6483350" cy="3856355"/>
+          <wp:inline distT="0" distB="0" distL="0" distR="0">
+            <wp:extent cx="6483350" cy="3855085"/>
             <wp:effectExtent l="0" t="0" r="0" b="0"/>
-            <wp:docPr id="117" name="Рисунок 117"/>
+            <wp:docPr id="140" name="Рисунок 140"/>
             <wp:cNvGraphicFramePr>
               <a:graphicFrameLocks xmlns:a="http://schemas.openxmlformats.org/drawingml/2006/main" noChangeAspect="1"/>
             </wp:cNvGraphicFramePr>
@@ -3093,23 +3421,36 @@
               <a:graphicData uri="http://schemas.openxmlformats.org/drawingml/2006/picture">
                 <pic:pic xmlns:pic="http://schemas.openxmlformats.org/drawingml/2006/picture">
                   <pic:nvPicPr>
-                    <pic:cNvPr id="1" name=""/>
-                    <pic:cNvPicPr/>
+                    <pic:cNvPr id="0" name="Рисунок 117"/>
+                    <pic:cNvPicPr>
+                      <a:picLocks noChangeAspect="1" noChangeArrowheads="1"/>
+                    </pic:cNvPicPr>
                   </pic:nvPicPr>
                   <pic:blipFill>
-                    <a:blip r:embed="rId41"/>
+                    <a:blip r:embed="rId41">
+                      <a:extLst>
+                        <a:ext uri="{28A0092B-C50C-407E-A947-70E740481C1C}">
+                          <a14:useLocalDpi xmlns:a14="http://schemas.microsoft.com/office/drawing/2010/main" val="0"/>
+                        </a:ext>
+                      </a:extLst>
+                    </a:blip>
+                    <a:srcRect/>
                     <a:stretch>
                       <a:fillRect/>
                     </a:stretch>
                   </pic:blipFill>
-                  <pic:spPr>
+                  <pic:spPr bwMode="auto">
                     <a:xfrm>
                       <a:off x="0" y="0"/>
-                      <a:ext cx="6483350" cy="3856355"/>
+                      <a:ext cx="6483350" cy="3855085"/>
                     </a:xfrm>
                     <a:prstGeom prst="rect">
                       <a:avLst/>
                     </a:prstGeom>
+                    <a:noFill/>
+                    <a:ln>
+                      <a:noFill/>
+                    </a:ln>
                   </pic:spPr>
                 </pic:pic>
               </a:graphicData>
@@ -3128,7 +3469,7 @@
         </w:rPr>
       </w:pPr>
       <w:r>
-        <w:t xml:space="preserve">Рисунок В.35 – </w:t>
+        <w:t xml:space="preserve">Рисунок 35 – </w:t>
       </w:r>
       <w:proofErr w:type="spellStart"/>
       <w:r>
@@ -3164,10 +3505,10 @@
           <w:lang w:val="ru-RU"/>
         </w:rPr>
         <w:drawing>
-          <wp:inline distT="0" distB="0" distL="0" distR="0" wp14:anchorId="64485631" wp14:editId="1B7F52CD">
-            <wp:extent cx="6483350" cy="2754630"/>
-            <wp:effectExtent l="0" t="0" r="0" b="7620"/>
-            <wp:docPr id="118" name="Рисунок 118"/>
+          <wp:inline distT="0" distB="0" distL="0" distR="0">
+            <wp:extent cx="6477000" cy="2750820"/>
+            <wp:effectExtent l="0" t="0" r="0" b="0"/>
+            <wp:docPr id="139" name="Рисунок 139"/>
             <wp:cNvGraphicFramePr>
               <a:graphicFrameLocks xmlns:a="http://schemas.openxmlformats.org/drawingml/2006/main" noChangeAspect="1"/>
             </wp:cNvGraphicFramePr>
@@ -3175,23 +3516,36 @@
               <a:graphicData uri="http://schemas.openxmlformats.org/drawingml/2006/picture">
                 <pic:pic xmlns:pic="http://schemas.openxmlformats.org/drawingml/2006/picture">
                   <pic:nvPicPr>
-                    <pic:cNvPr id="1" name=""/>
-                    <pic:cNvPicPr/>
+                    <pic:cNvPr id="0" name="Рисунок 118"/>
+                    <pic:cNvPicPr>
+                      <a:picLocks noChangeAspect="1" noChangeArrowheads="1"/>
+                    </pic:cNvPicPr>
                   </pic:nvPicPr>
                   <pic:blipFill>
-                    <a:blip r:embed="rId42"/>
+                    <a:blip r:embed="rId42">
+                      <a:extLst>
+                        <a:ext uri="{28A0092B-C50C-407E-A947-70E740481C1C}">
+                          <a14:useLocalDpi xmlns:a14="http://schemas.microsoft.com/office/drawing/2010/main" val="0"/>
+                        </a:ext>
+                      </a:extLst>
+                    </a:blip>
+                    <a:srcRect/>
                     <a:stretch>
                       <a:fillRect/>
                     </a:stretch>
                   </pic:blipFill>
-                  <pic:spPr>
+                  <pic:spPr bwMode="auto">
                     <a:xfrm>
                       <a:off x="0" y="0"/>
-                      <a:ext cx="6483350" cy="2754630"/>
+                      <a:ext cx="6477000" cy="2750820"/>
                     </a:xfrm>
                     <a:prstGeom prst="rect">
                       <a:avLst/>
                     </a:prstGeom>
+                    <a:noFill/>
+                    <a:ln>
+                      <a:noFill/>
+                    </a:ln>
                   </pic:spPr>
                 </pic:pic>
               </a:graphicData>
@@ -3210,7 +3564,7 @@
         </w:rPr>
       </w:pPr>
       <w:r>
-        <w:t xml:space="preserve">Рисунок В.36 – </w:t>
+        <w:t xml:space="preserve">Рисунок 36 – </w:t>
       </w:r>
       <w:proofErr w:type="spellStart"/>
       <w:r>
@@ -3247,10 +3601,10 @@
         </w:rPr>
         <w:lastRenderedPageBreak/>
         <w:drawing>
-          <wp:inline distT="0" distB="0" distL="0" distR="0" wp14:anchorId="79EA4222" wp14:editId="191D2A56">
-            <wp:extent cx="6483350" cy="4806950"/>
+          <wp:inline distT="0" distB="0" distL="0" distR="0">
+            <wp:extent cx="6483350" cy="4807585"/>
             <wp:effectExtent l="0" t="0" r="0" b="0"/>
-            <wp:docPr id="121" name="Рисунок 121"/>
+            <wp:docPr id="138" name="Рисунок 138"/>
             <wp:cNvGraphicFramePr>
               <a:graphicFrameLocks xmlns:a="http://schemas.openxmlformats.org/drawingml/2006/main" noChangeAspect="1"/>
             </wp:cNvGraphicFramePr>
@@ -3258,23 +3612,36 @@
               <a:graphicData uri="http://schemas.openxmlformats.org/drawingml/2006/picture">
                 <pic:pic xmlns:pic="http://schemas.openxmlformats.org/drawingml/2006/picture">
                   <pic:nvPicPr>
-                    <pic:cNvPr id="1" name=""/>
-                    <pic:cNvPicPr/>
+                    <pic:cNvPr id="0" name="Рисунок 121"/>
+                    <pic:cNvPicPr>
+                      <a:picLocks noChangeAspect="1" noChangeArrowheads="1"/>
+                    </pic:cNvPicPr>
                   </pic:nvPicPr>
                   <pic:blipFill>
-                    <a:blip r:embed="rId43"/>
+                    <a:blip r:embed="rId43">
+                      <a:extLst>
+                        <a:ext uri="{28A0092B-C50C-407E-A947-70E740481C1C}">
+                          <a14:useLocalDpi xmlns:a14="http://schemas.microsoft.com/office/drawing/2010/main" val="0"/>
+                        </a:ext>
+                      </a:extLst>
+                    </a:blip>
+                    <a:srcRect/>
                     <a:stretch>
                       <a:fillRect/>
                     </a:stretch>
                   </pic:blipFill>
-                  <pic:spPr>
+                  <pic:spPr bwMode="auto">
                     <a:xfrm>
                       <a:off x="0" y="0"/>
-                      <a:ext cx="6483350" cy="4806950"/>
+                      <a:ext cx="6483350" cy="4807585"/>
                     </a:xfrm>
                     <a:prstGeom prst="rect">
                       <a:avLst/>
                     </a:prstGeom>
+                    <a:noFill/>
+                    <a:ln>
+                      <a:noFill/>
+                    </a:ln>
                   </pic:spPr>
                 </pic:pic>
               </a:graphicData>
@@ -3290,10 +3657,7 @@
         <w:jc w:val="center"/>
       </w:pPr>
       <w:r>
-        <w:t xml:space="preserve">Рисунок В.37 – Схеми </w:t>
-      </w:r>
-      <w:r>
-        <w:t xml:space="preserve">об’єктів запитів та відповідей </w:t>
+        <w:t xml:space="preserve">Рисунок 37 – Схеми об’єктів запитів та відповідей </w:t>
       </w:r>
       <w:r>
         <w:rPr>
@@ -3327,10 +3691,10 @@
           <w:lang w:val="ru-RU"/>
         </w:rPr>
         <w:drawing>
-          <wp:inline distT="0" distB="0" distL="0" distR="0" wp14:anchorId="6ADB70D9" wp14:editId="7B2EB14F">
-            <wp:extent cx="5044440" cy="3829525"/>
+          <wp:inline distT="0" distB="0" distL="0" distR="0">
+            <wp:extent cx="5044440" cy="3832860"/>
             <wp:effectExtent l="0" t="0" r="3810" b="0"/>
-            <wp:docPr id="120" name="Рисунок 120"/>
+            <wp:docPr id="137" name="Рисунок 137"/>
             <wp:cNvGraphicFramePr>
               <a:graphicFrameLocks xmlns:a="http://schemas.openxmlformats.org/drawingml/2006/main" noChangeAspect="1"/>
             </wp:cNvGraphicFramePr>
@@ -3338,23 +3702,36 @@
               <a:graphicData uri="http://schemas.openxmlformats.org/drawingml/2006/picture">
                 <pic:pic xmlns:pic="http://schemas.openxmlformats.org/drawingml/2006/picture">
                   <pic:nvPicPr>
-                    <pic:cNvPr id="1" name=""/>
-                    <pic:cNvPicPr/>
+                    <pic:cNvPr id="0" name="Рисунок 120"/>
+                    <pic:cNvPicPr>
+                      <a:picLocks noChangeAspect="1" noChangeArrowheads="1"/>
+                    </pic:cNvPicPr>
                   </pic:nvPicPr>
                   <pic:blipFill>
-                    <a:blip r:embed="rId44"/>
+                    <a:blip r:embed="rId44">
+                      <a:extLst>
+                        <a:ext uri="{28A0092B-C50C-407E-A947-70E740481C1C}">
+                          <a14:useLocalDpi xmlns:a14="http://schemas.microsoft.com/office/drawing/2010/main" val="0"/>
+                        </a:ext>
+                      </a:extLst>
+                    </a:blip>
+                    <a:srcRect/>
                     <a:stretch>
                       <a:fillRect/>
                     </a:stretch>
                   </pic:blipFill>
-                  <pic:spPr>
+                  <pic:spPr bwMode="auto">
                     <a:xfrm>
                       <a:off x="0" y="0"/>
-                      <a:ext cx="5057256" cy="3839254"/>
+                      <a:ext cx="5044440" cy="3832860"/>
                     </a:xfrm>
                     <a:prstGeom prst="rect">
                       <a:avLst/>
                     </a:prstGeom>
+                    <a:noFill/>
+                    <a:ln>
+                      <a:noFill/>
+                    </a:ln>
                   </pic:spPr>
                 </pic:pic>
               </a:graphicData>
@@ -3373,10 +3750,7 @@
         </w:rPr>
       </w:pPr>
       <w:r>
-        <w:t xml:space="preserve">Рисунок В.38 – Схеми </w:t>
-      </w:r>
-      <w:r>
-        <w:t xml:space="preserve">об’єктів запитів та відповідей </w:t>
+        <w:t xml:space="preserve">Рисунок 38 – Схеми об’єктів запитів та відповідей </w:t>
       </w:r>
       <w:r>
         <w:rPr>
@@ -3389,17 +3763,6 @@
       <w:pPr>
         <w:pStyle w:val="a3"/>
         <w:spacing w:line="360" w:lineRule="auto"/>
-        <w:jc w:val="center"/>
-        <w:rPr>
-          <w:lang w:val="ru-RU"/>
-        </w:rPr>
-      </w:pPr>
-    </w:p>
-    <w:p>
-      <w:pPr>
-        <w:pStyle w:val="a3"/>
-        <w:spacing w:line="360" w:lineRule="auto"/>
-        <w:jc w:val="center"/>
         <w:rPr>
           <w:lang w:val="ru-RU"/>
         </w:rPr>
@@ -3420,10 +3783,10 @@
           <w:lang w:val="ru-RU"/>
         </w:rPr>
         <w:drawing>
-          <wp:inline distT="0" distB="0" distL="0" distR="0" wp14:anchorId="77AD035B" wp14:editId="5346ADC7">
-            <wp:extent cx="4935520" cy="4130658"/>
-            <wp:effectExtent l="0" t="0" r="0" b="3810"/>
-            <wp:docPr id="122" name="Рисунок 122"/>
+          <wp:inline distT="0" distB="0" distL="0" distR="0">
+            <wp:extent cx="4930140" cy="4130040"/>
+            <wp:effectExtent l="0" t="0" r="3810" b="3810"/>
+            <wp:docPr id="136" name="Рисунок 136"/>
             <wp:cNvGraphicFramePr>
               <a:graphicFrameLocks xmlns:a="http://schemas.openxmlformats.org/drawingml/2006/main" noChangeAspect="1"/>
             </wp:cNvGraphicFramePr>
@@ -3431,23 +3794,36 @@
               <a:graphicData uri="http://schemas.openxmlformats.org/drawingml/2006/picture">
                 <pic:pic xmlns:pic="http://schemas.openxmlformats.org/drawingml/2006/picture">
                   <pic:nvPicPr>
-                    <pic:cNvPr id="1" name=""/>
-                    <pic:cNvPicPr/>
+                    <pic:cNvPr id="0" name="Рисунок 122"/>
+                    <pic:cNvPicPr>
+                      <a:picLocks noChangeAspect="1" noChangeArrowheads="1"/>
+                    </pic:cNvPicPr>
                   </pic:nvPicPr>
                   <pic:blipFill>
-                    <a:blip r:embed="rId45"/>
+                    <a:blip r:embed="rId45">
+                      <a:extLst>
+                        <a:ext uri="{28A0092B-C50C-407E-A947-70E740481C1C}">
+                          <a14:useLocalDpi xmlns:a14="http://schemas.microsoft.com/office/drawing/2010/main" val="0"/>
+                        </a:ext>
+                      </a:extLst>
+                    </a:blip>
+                    <a:srcRect/>
                     <a:stretch>
                       <a:fillRect/>
                     </a:stretch>
                   </pic:blipFill>
-                  <pic:spPr>
+                  <pic:spPr bwMode="auto">
                     <a:xfrm>
                       <a:off x="0" y="0"/>
-                      <a:ext cx="4965005" cy="4155335"/>
+                      <a:ext cx="4930140" cy="4130040"/>
                     </a:xfrm>
                     <a:prstGeom prst="rect">
                       <a:avLst/>
                     </a:prstGeom>
+                    <a:noFill/>
+                    <a:ln>
+                      <a:noFill/>
+                    </a:ln>
                   </pic:spPr>
                 </pic:pic>
               </a:graphicData>
@@ -3461,15 +3837,9 @@
         <w:pStyle w:val="a3"/>
         <w:spacing w:line="360" w:lineRule="auto"/>
         <w:jc w:val="center"/>
-        <w:rPr>
-          <w:lang w:val="ru-RU"/>
-        </w:rPr>
-      </w:pPr>
-      <w:r>
-        <w:t xml:space="preserve">Рисунок В.39 – Схеми </w:t>
-      </w:r>
-      <w:r>
-        <w:t xml:space="preserve">об’єктів запитів та відповідей </w:t>
+      </w:pPr>
+      <w:r>
+        <w:t xml:space="preserve">Рисунок 39 – Схеми об’єктів запитів та відповідей </w:t>
       </w:r>
       <w:r>
         <w:rPr>
@@ -3483,9 +3853,6 @@
         <w:pStyle w:val="a3"/>
         <w:spacing w:line="360" w:lineRule="auto"/>
         <w:jc w:val="center"/>
-        <w:rPr>
-          <w:lang w:val="ru-RU"/>
-        </w:rPr>
       </w:pPr>
     </w:p>
     <w:p>
@@ -3503,10 +3870,10 @@
           <w:lang w:val="ru-RU"/>
         </w:rPr>
         <w:drawing>
-          <wp:inline distT="0" distB="0" distL="0" distR="0" wp14:anchorId="33A46D6A" wp14:editId="5660B9A3">
-            <wp:extent cx="5166360" cy="4249469"/>
-            <wp:effectExtent l="0" t="0" r="0" b="0"/>
-            <wp:docPr id="123" name="Рисунок 123"/>
+          <wp:inline distT="0" distB="0" distL="0" distR="0">
+            <wp:extent cx="4899660" cy="4030980"/>
+            <wp:effectExtent l="0" t="0" r="0" b="7620"/>
+            <wp:docPr id="135" name="Рисунок 135"/>
             <wp:cNvGraphicFramePr>
               <a:graphicFrameLocks xmlns:a="http://schemas.openxmlformats.org/drawingml/2006/main" noChangeAspect="1"/>
             </wp:cNvGraphicFramePr>
@@ -3514,23 +3881,36 @@
               <a:graphicData uri="http://schemas.openxmlformats.org/drawingml/2006/picture">
                 <pic:pic xmlns:pic="http://schemas.openxmlformats.org/drawingml/2006/picture">
                   <pic:nvPicPr>
-                    <pic:cNvPr id="1" name=""/>
-                    <pic:cNvPicPr/>
+                    <pic:cNvPr id="0" name="Рисунок 123"/>
+                    <pic:cNvPicPr>
+                      <a:picLocks noChangeAspect="1" noChangeArrowheads="1"/>
+                    </pic:cNvPicPr>
                   </pic:nvPicPr>
                   <pic:blipFill>
-                    <a:blip r:embed="rId46"/>
+                    <a:blip r:embed="rId46" cstate="print">
+                      <a:extLst>
+                        <a:ext uri="{28A0092B-C50C-407E-A947-70E740481C1C}">
+                          <a14:useLocalDpi xmlns:a14="http://schemas.microsoft.com/office/drawing/2010/main" val="0"/>
+                        </a:ext>
+                      </a:extLst>
+                    </a:blip>
+                    <a:srcRect/>
                     <a:stretch>
                       <a:fillRect/>
                     </a:stretch>
                   </pic:blipFill>
-                  <pic:spPr>
+                  <pic:spPr bwMode="auto">
                     <a:xfrm>
                       <a:off x="0" y="0"/>
-                      <a:ext cx="5185974" cy="4265602"/>
+                      <a:ext cx="4899660" cy="4030980"/>
                     </a:xfrm>
                     <a:prstGeom prst="rect">
                       <a:avLst/>
                     </a:prstGeom>
+                    <a:noFill/>
+                    <a:ln>
+                      <a:noFill/>
+                    </a:ln>
                   </pic:spPr>
                 </pic:pic>
               </a:graphicData>
@@ -3549,48 +3929,45 @@
         </w:rPr>
       </w:pPr>
       <w:r>
+        <w:t xml:space="preserve">Рисунок 40 – Схеми об’єктів запитів та відповідей </w:t>
+      </w:r>
+      <w:r>
+        <w:rPr>
+          <w:lang w:val="en-US"/>
+        </w:rPr>
+        <w:t>API</w:t>
+      </w:r>
+    </w:p>
+    <w:p>
+      <w:pPr>
+        <w:pStyle w:val="a3"/>
+        <w:spacing w:line="360" w:lineRule="auto"/>
+        <w:jc w:val="center"/>
+        <w:rPr>
+          <w:lang w:val="ru-RU"/>
+        </w:rPr>
+      </w:pPr>
+    </w:p>
+    <w:p>
+      <w:pPr>
+        <w:pStyle w:val="a3"/>
+        <w:spacing w:line="360" w:lineRule="auto"/>
+        <w:jc w:val="center"/>
+        <w:rPr>
+          <w:lang w:val="ru-RU"/>
+        </w:rPr>
+      </w:pPr>
+      <w:r>
+        <w:rPr>
+          <w:noProof/>
+          <w:lang w:val="ru-RU"/>
+        </w:rPr>
         <w:lastRenderedPageBreak/>
-        <w:t xml:space="preserve">Рисунок В.40 – Схеми </w:t>
-      </w:r>
-      <w:r>
-        <w:t xml:space="preserve">об’єктів запитів та відповідей </w:t>
-      </w:r>
-      <w:r>
-        <w:rPr>
-          <w:lang w:val="en-US"/>
-        </w:rPr>
-        <w:t>API</w:t>
-      </w:r>
-    </w:p>
-    <w:p>
-      <w:pPr>
-        <w:pStyle w:val="a3"/>
-        <w:spacing w:line="360" w:lineRule="auto"/>
-        <w:jc w:val="center"/>
-        <w:rPr>
-          <w:lang w:val="ru-RU"/>
-        </w:rPr>
-      </w:pPr>
-    </w:p>
-    <w:p>
-      <w:pPr>
-        <w:pStyle w:val="a3"/>
-        <w:spacing w:line="360" w:lineRule="auto"/>
-        <w:jc w:val="center"/>
-        <w:rPr>
-          <w:lang w:val="ru-RU"/>
-        </w:rPr>
-      </w:pPr>
-      <w:r>
-        <w:rPr>
-          <w:noProof/>
-          <w:lang w:val="ru-RU"/>
-        </w:rPr>
         <w:drawing>
-          <wp:inline distT="0" distB="0" distL="0" distR="0" wp14:anchorId="6B82B1D3" wp14:editId="0FF58C9B">
-            <wp:extent cx="5153737" cy="4132580"/>
-            <wp:effectExtent l="0" t="0" r="8890" b="1270"/>
-            <wp:docPr id="124" name="Рисунок 124"/>
+          <wp:inline distT="0" distB="0" distL="0" distR="0">
+            <wp:extent cx="4968240" cy="3985260"/>
+            <wp:effectExtent l="0" t="0" r="3810" b="0"/>
+            <wp:docPr id="134" name="Рисунок 134"/>
             <wp:cNvGraphicFramePr>
               <a:graphicFrameLocks xmlns:a="http://schemas.openxmlformats.org/drawingml/2006/main" noChangeAspect="1"/>
             </wp:cNvGraphicFramePr>
@@ -3598,23 +3975,36 @@
               <a:graphicData uri="http://schemas.openxmlformats.org/drawingml/2006/picture">
                 <pic:pic xmlns:pic="http://schemas.openxmlformats.org/drawingml/2006/picture">
                   <pic:nvPicPr>
-                    <pic:cNvPr id="1" name=""/>
-                    <pic:cNvPicPr/>
+                    <pic:cNvPr id="0" name="Рисунок 124"/>
+                    <pic:cNvPicPr>
+                      <a:picLocks noChangeAspect="1" noChangeArrowheads="1"/>
+                    </pic:cNvPicPr>
                   </pic:nvPicPr>
                   <pic:blipFill>
-                    <a:blip r:embed="rId47"/>
+                    <a:blip r:embed="rId47">
+                      <a:extLst>
+                        <a:ext uri="{28A0092B-C50C-407E-A947-70E740481C1C}">
+                          <a14:useLocalDpi xmlns:a14="http://schemas.microsoft.com/office/drawing/2010/main" val="0"/>
+                        </a:ext>
+                      </a:extLst>
+                    </a:blip>
+                    <a:srcRect/>
                     <a:stretch>
                       <a:fillRect/>
                     </a:stretch>
                   </pic:blipFill>
-                  <pic:spPr>
+                  <pic:spPr bwMode="auto">
                     <a:xfrm>
                       <a:off x="0" y="0"/>
-                      <a:ext cx="5170130" cy="4145725"/>
+                      <a:ext cx="4968240" cy="3985260"/>
                     </a:xfrm>
                     <a:prstGeom prst="rect">
                       <a:avLst/>
                     </a:prstGeom>
+                    <a:noFill/>
+                    <a:ln>
+                      <a:noFill/>
+                    </a:ln>
                   </pic:spPr>
                 </pic:pic>
               </a:graphicData>
@@ -3629,19 +4019,16 @@
         <w:spacing w:line="360" w:lineRule="auto"/>
         <w:jc w:val="center"/>
         <w:rPr>
-          <w:lang w:val="ru-RU"/>
-        </w:rPr>
-      </w:pPr>
-      <w:r>
-        <w:t xml:space="preserve">Рисунок В.41 – Схеми </w:t>
-      </w:r>
-      <w:r>
-        <w:t xml:space="preserve">об’єктів запитів та відповідей </w:t>
-      </w:r>
-      <w:r>
-        <w:rPr>
           <w:lang w:val="en-US"/>
         </w:rPr>
+      </w:pPr>
+      <w:r>
+        <w:t xml:space="preserve">Рисунок 41 – Схеми об’єктів запитів та відповідей </w:t>
+      </w:r>
+      <w:r>
+        <w:rPr>
+          <w:lang w:val="en-US"/>
+        </w:rPr>
         <w:t>API</w:t>
       </w:r>
     </w:p>
@@ -3670,10 +4057,10 @@
           <w:lang w:val="ru-RU"/>
         </w:rPr>
         <w:drawing>
-          <wp:inline distT="0" distB="0" distL="0" distR="0" wp14:anchorId="29105424" wp14:editId="538BD8D7">
-            <wp:extent cx="5814060" cy="3986703"/>
+          <wp:inline distT="0" distB="0" distL="0" distR="0">
+            <wp:extent cx="5814060" cy="3985260"/>
             <wp:effectExtent l="0" t="0" r="0" b="0"/>
-            <wp:docPr id="125" name="Рисунок 125"/>
+            <wp:docPr id="133" name="Рисунок 133"/>
             <wp:cNvGraphicFramePr>
               <a:graphicFrameLocks xmlns:a="http://schemas.openxmlformats.org/drawingml/2006/main" noChangeAspect="1"/>
             </wp:cNvGraphicFramePr>
@@ -3681,23 +4068,36 @@
               <a:graphicData uri="http://schemas.openxmlformats.org/drawingml/2006/picture">
                 <pic:pic xmlns:pic="http://schemas.openxmlformats.org/drawingml/2006/picture">
                   <pic:nvPicPr>
-                    <pic:cNvPr id="1" name=""/>
-                    <pic:cNvPicPr/>
+                    <pic:cNvPr id="0" name="Рисунок 125"/>
+                    <pic:cNvPicPr>
+                      <a:picLocks noChangeAspect="1" noChangeArrowheads="1"/>
+                    </pic:cNvPicPr>
                   </pic:nvPicPr>
                   <pic:blipFill>
-                    <a:blip r:embed="rId48"/>
+                    <a:blip r:embed="rId48">
+                      <a:extLst>
+                        <a:ext uri="{28A0092B-C50C-407E-A947-70E740481C1C}">
+                          <a14:useLocalDpi xmlns:a14="http://schemas.microsoft.com/office/drawing/2010/main" val="0"/>
+                        </a:ext>
+                      </a:extLst>
+                    </a:blip>
+                    <a:srcRect/>
                     <a:stretch>
                       <a:fillRect/>
                     </a:stretch>
                   </pic:blipFill>
-                  <pic:spPr>
+                  <pic:spPr bwMode="auto">
                     <a:xfrm>
                       <a:off x="0" y="0"/>
-                      <a:ext cx="5825621" cy="3994630"/>
+                      <a:ext cx="5814060" cy="3985260"/>
                     </a:xfrm>
                     <a:prstGeom prst="rect">
                       <a:avLst/>
                     </a:prstGeom>
+                    <a:noFill/>
+                    <a:ln>
+                      <a:noFill/>
+                    </a:ln>
                   </pic:spPr>
                 </pic:pic>
               </a:graphicData>
@@ -3716,10 +4116,7 @@
         </w:rPr>
       </w:pPr>
       <w:r>
-        <w:t xml:space="preserve">Рисунок В.42 – Схеми </w:t>
-      </w:r>
-      <w:r>
-        <w:t xml:space="preserve">об’єктів запитів та відповідей </w:t>
+        <w:t xml:space="preserve">Рисунок 42 – Схеми об’єктів запитів та відповідей </w:t>
       </w:r>
       <w:r>
         <w:rPr>
@@ -3752,11 +4149,12 @@
           <w:noProof/>
           <w:lang w:val="ru-RU"/>
         </w:rPr>
+        <w:lastRenderedPageBreak/>
         <w:drawing>
-          <wp:inline distT="0" distB="0" distL="0" distR="0" wp14:anchorId="4FA1761F" wp14:editId="1C5ABA0A">
+          <wp:inline distT="0" distB="0" distL="0" distR="0">
             <wp:extent cx="6483350" cy="2018665"/>
             <wp:effectExtent l="0" t="0" r="0" b="635"/>
-            <wp:docPr id="126" name="Рисунок 126"/>
+            <wp:docPr id="132" name="Рисунок 132"/>
             <wp:cNvGraphicFramePr>
               <a:graphicFrameLocks xmlns:a="http://schemas.openxmlformats.org/drawingml/2006/main" noChangeAspect="1"/>
             </wp:cNvGraphicFramePr>
@@ -3764,16 +4162,25 @@
               <a:graphicData uri="http://schemas.openxmlformats.org/drawingml/2006/picture">
                 <pic:pic xmlns:pic="http://schemas.openxmlformats.org/drawingml/2006/picture">
                   <pic:nvPicPr>
-                    <pic:cNvPr id="1" name=""/>
-                    <pic:cNvPicPr/>
+                    <pic:cNvPr id="0" name="Рисунок 126"/>
+                    <pic:cNvPicPr>
+                      <a:picLocks noChangeAspect="1" noChangeArrowheads="1"/>
+                    </pic:cNvPicPr>
                   </pic:nvPicPr>
                   <pic:blipFill>
-                    <a:blip r:embed="rId49"/>
+                    <a:blip r:embed="rId49">
+                      <a:extLst>
+                        <a:ext uri="{28A0092B-C50C-407E-A947-70E740481C1C}">
+                          <a14:useLocalDpi xmlns:a14="http://schemas.microsoft.com/office/drawing/2010/main" val="0"/>
+                        </a:ext>
+                      </a:extLst>
+                    </a:blip>
+                    <a:srcRect/>
                     <a:stretch>
                       <a:fillRect/>
                     </a:stretch>
                   </pic:blipFill>
-                  <pic:spPr>
+                  <pic:spPr bwMode="auto">
                     <a:xfrm>
                       <a:off x="0" y="0"/>
                       <a:ext cx="6483350" cy="2018665"/>
@@ -3781,6 +4188,10 @@
                     <a:prstGeom prst="rect">
                       <a:avLst/>
                     </a:prstGeom>
+                    <a:noFill/>
+                    <a:ln>
+                      <a:noFill/>
+                    </a:ln>
                   </pic:spPr>
                 </pic:pic>
               </a:graphicData>
@@ -3793,16 +4204,15 @@
       <w:pPr>
         <w:pStyle w:val="a3"/>
         <w:spacing w:line="360" w:lineRule="auto"/>
-        <w:jc w:val="center"/>
-        <w:rPr>
-          <w:lang w:val="ru-RU"/>
-        </w:rPr>
-      </w:pPr>
-      <w:r>
-        <w:t xml:space="preserve">Рисунок В.43 – Схеми </w:t>
-      </w:r>
-      <w:r>
-        <w:t xml:space="preserve">об’єктів запитів та відповідей </w:t>
+        <w:ind w:firstLine="709"/>
+        <w:jc w:val="center"/>
+        <w:rPr>
+          <w:lang w:val="ru-RU"/>
+        </w:rPr>
+      </w:pPr>
+      <w:bookmarkStart w:id="1" w:name="_GoBack"/>
+      <w:r>
+        <w:t xml:space="preserve">Рисунок 43 – Схеми об’єктів запитів та відповідей </w:t>
       </w:r>
       <w:r>
         <w:rPr>
@@ -3810,16 +4220,6 @@
         </w:rPr>
         <w:t>API</w:t>
       </w:r>
-    </w:p>
-    <w:p>
-      <w:pPr>
-        <w:rPr>
-          <w:sz w:val="28"/>
-          <w:szCs w:val="28"/>
-          <w:lang w:val="ru-RU"/>
-        </w:rPr>
-      </w:pPr>
-      <w:bookmarkStart w:id="1" w:name="_GoBack"/>
       <w:bookmarkEnd w:id="1"/>
     </w:p>
     <w:sectPr>

</xml_diff>